<commit_message>
Update methodology doc to v3.0 — add full lifecycle forecast sections
Extends the methodology document from decline-only (V5.1) to the complete
two-engine framework:

- Reframed summary + title page around two engines (decline + pre-peak forecast)
- New Section 11: Pre-peak forecasting — ex-ante variable discipline, peak model,
  ramp/plateau/decline sub-models, joint-bootstrap lifecycle integration
- New Section 12: Out-of-sample hold-out validation — the honest peak ~35% finding,
  why log-R²=0.84 and 35% linear error coexist, correct ER usage
- New Section 13: Yggdrasil case study — triangulated scenarios, component
  decomposition, ER interpretation (upside to guidance with honest band)
- Appendix A extended with forecast-suite development history
- Decline numbers updated to V5.1 honest nested CV (0.662)

13 sections + 3 appendices, 17 tables, 7 figures. Copied to OneDrive.

Co-Authored-By: Claude Opus 4.8 (1M context) <noreply@anthropic.com>
</commit_message>
<xml_diff>
--- a/analyses/decline_quality/docs/NCS_Decline_Model_Methodology.docx
+++ b/analyses/decline_quality/docs/NCS_Decline_Model_Methodology.docx
@@ -88,7 +88,7 @@
           <w:color w:val="E65100"/>
           <w:sz w:val="24"/>
         </w:rPr>
-        <w:t>Versjon 2.1 — med QA-fikser &amp; nested CV</w:t>
+        <w:t>Versjon 3.0 — full lifecycle (decline + pre-peak forecast)</w:t>
       </w:r>
     </w:p>
     <w:p>
@@ -194,13 +194,14 @@
         <w:tblLook w:firstColumn="1" w:firstRow="1" w:lastColumn="0" w:lastRow="0" w:noHBand="0" w:noVBand="1" w:val="04A0"/>
       </w:tblPr>
       <w:tblGrid>
-        <w:gridCol w:w="4680"/>
-        <w:gridCol w:w="4680"/>
+        <w:gridCol w:w="3120"/>
+        <w:gridCol w:w="3120"/>
+        <w:gridCol w:w="3120"/>
       </w:tblGrid>
       <w:tr>
         <w:tc>
           <w:tcPr>
-            <w:tcW w:type="dxa" w:w="5040"/>
+            <w:tcW w:type="dxa" w:w="3456"/>
             <w:shd w:fill="1F4E79" w:val="clear"/>
             <w:tcBorders>
               <w:top w:val="single" w:sz="4" w:color="CCCCCC"/>
@@ -222,13 +223,13 @@
                 <w:color w:val="FFFFFF"/>
                 <w:sz w:val="20"/>
               </w:rPr>
-              <w:t>Modell-ytelse (V5)</w:t>
-            </w:r>
-          </w:p>
-        </w:tc>
-        <w:tc>
-          <w:tcPr>
-            <w:tcW w:type="dxa" w:w="3600"/>
+              <w:t>Motor</w:t>
+            </w:r>
+          </w:p>
+        </w:tc>
+        <w:tc>
+          <w:tcPr>
+            <w:tcW w:type="dxa" w:w="4320"/>
             <w:shd w:fill="1F4E79" w:val="clear"/>
             <w:tcBorders>
               <w:top w:val="single" w:sz="4" w:color="CCCCCC"/>
@@ -250,37 +251,14 @@
                 <w:color w:val="FFFFFF"/>
                 <w:sz w:val="20"/>
               </w:rPr>
-              <w:t>Verdi</w:t>
-            </w:r>
-          </w:p>
-        </w:tc>
-      </w:tr>
-      <w:tr>
-        <w:tc>
-          <w:tcPr>
-            <w:tcW w:type="dxa" w:w="4680"/>
-            <w:tcBorders>
-              <w:top w:val="single" w:sz="4" w:color="CCCCCC"/>
-              <w:bottom w:val="single" w:sz="4" w:color="CCCCCC"/>
-              <w:left w:val="single" w:sz="4" w:color="CCCCCC"/>
-              <w:right w:val="single" w:sz="4" w:color="CCCCCC"/>
-            </w:tcBorders>
-            <w:vAlign w:val="center"/>
-          </w:tcPr>
-          <w:p>
-            <w:r/>
-            <w:r>
-              <w:rPr>
-                <w:rFonts w:ascii="Arial" w:hAnsi="Arial"/>
-                <w:sz w:val="20"/>
-              </w:rPr>
-              <w:t>Nested CV R²</w:t>
-            </w:r>
-          </w:p>
-        </w:tc>
-        <w:tc>
-          <w:tcPr>
-            <w:tcW w:type="dxa" w:w="4680"/>
+              <w:t>Nøkkelmetrikk</w:t>
+            </w:r>
+          </w:p>
+        </w:tc>
+        <w:tc>
+          <w:tcPr>
+            <w:tcW w:type="dxa" w:w="2880"/>
+            <w:shd w:fill="1F4E79" w:val="clear"/>
             <w:tcBorders>
               <w:top w:val="single" w:sz="4" w:color="CCCCCC"/>
               <w:bottom w:val="single" w:sz="4" w:color="CCCCCC"/>
@@ -298,10 +276,10 @@
               <w:rPr>
                 <w:rFonts w:ascii="Arial" w:hAnsi="Arial"/>
                 <w:b/>
-                <w:color w:val="2E7D32"/>
-                <w:sz w:val="20"/>
-              </w:rPr>
-              <w:t>0.662</w:t>
+                <w:color w:val="FFFFFF"/>
+                <w:sz w:val="20"/>
+              </w:rPr>
+              <w:t>Verdi</w:t>
             </w:r>
           </w:p>
         </w:tc>
@@ -309,48 +287,70 @@
       <w:tr>
         <w:tc>
           <w:tcPr>
-            <w:tcW w:type="dxa" w:w="4680"/>
-            <w:tcBorders>
-              <w:top w:val="single" w:sz="4" w:color="CCCCCC"/>
-              <w:bottom w:val="single" w:sz="4" w:color="CCCCCC"/>
-              <w:left w:val="single" w:sz="4" w:color="CCCCCC"/>
-              <w:right w:val="single" w:sz="4" w:color="CCCCCC"/>
-            </w:tcBorders>
-            <w:vAlign w:val="center"/>
-          </w:tcPr>
-          <w:p>
-            <w:r/>
-            <w:r>
-              <w:rPr>
-                <w:rFonts w:ascii="Arial" w:hAnsi="Arial"/>
-                <w:sz w:val="20"/>
-              </w:rPr>
-              <w:t>In-sample R²</w:t>
-            </w:r>
-          </w:p>
-        </w:tc>
-        <w:tc>
-          <w:tcPr>
-            <w:tcW w:type="dxa" w:w="4680"/>
-            <w:tcBorders>
-              <w:top w:val="single" w:sz="4" w:color="CCCCCC"/>
-              <w:bottom w:val="single" w:sz="4" w:color="CCCCCC"/>
-              <w:left w:val="single" w:sz="4" w:color="CCCCCC"/>
-              <w:right w:val="single" w:sz="4" w:color="CCCCCC"/>
-            </w:tcBorders>
-            <w:vAlign w:val="center"/>
-          </w:tcPr>
-          <w:p>
-            <w:pPr>
-              <w:jc w:val="center"/>
-            </w:pPr>
-            <w:r/>
-            <w:r>
-              <w:rPr>
-                <w:rFonts w:ascii="Arial" w:hAnsi="Arial"/>
-                <w:sz w:val="20"/>
-              </w:rPr>
-              <w:t>0.742</w:t>
+            <w:tcW w:type="dxa" w:w="3120"/>
+            <w:tcBorders>
+              <w:top w:val="single" w:sz="4" w:color="CCCCCC"/>
+              <w:bottom w:val="single" w:sz="4" w:color="CCCCCC"/>
+              <w:left w:val="single" w:sz="4" w:color="CCCCCC"/>
+              <w:right w:val="single" w:sz="4" w:color="CCCCCC"/>
+            </w:tcBorders>
+            <w:vAlign w:val="center"/>
+          </w:tcPr>
+          <w:p>
+            <w:r/>
+            <w:r>
+              <w:rPr>
+                <w:rFonts w:ascii="Arial" w:hAnsi="Arial"/>
+                <w:b/>
+                <w:sz w:val="20"/>
+              </w:rPr>
+              <w:t>Decline (V5.1)</w:t>
+            </w:r>
+          </w:p>
+        </w:tc>
+        <w:tc>
+          <w:tcPr>
+            <w:tcW w:type="dxa" w:w="3120"/>
+            <w:tcBorders>
+              <w:top w:val="single" w:sz="4" w:color="CCCCCC"/>
+              <w:bottom w:val="single" w:sz="4" w:color="CCCCCC"/>
+              <w:left w:val="single" w:sz="4" w:color="CCCCCC"/>
+              <w:right w:val="single" w:sz="4" w:color="CCCCCC"/>
+            </w:tcBorders>
+            <w:vAlign w:val="center"/>
+          </w:tcPr>
+          <w:p>
+            <w:r/>
+            <w:r>
+              <w:rPr>
+                <w:rFonts w:ascii="Arial" w:hAnsi="Arial"/>
+                <w:sz w:val="20"/>
+              </w:rPr>
+              <w:t>Nested CV R²</w:t>
+            </w:r>
+          </w:p>
+        </w:tc>
+        <w:tc>
+          <w:tcPr>
+            <w:tcW w:type="dxa" w:w="3120"/>
+            <w:tcBorders>
+              <w:top w:val="single" w:sz="4" w:color="CCCCCC"/>
+              <w:bottom w:val="single" w:sz="4" w:color="CCCCCC"/>
+              <w:left w:val="single" w:sz="4" w:color="CCCCCC"/>
+              <w:right w:val="single" w:sz="4" w:color="CCCCCC"/>
+            </w:tcBorders>
+            <w:vAlign w:val="center"/>
+          </w:tcPr>
+          <w:p>
+            <w:r/>
+            <w:r>
+              <w:rPr>
+                <w:rFonts w:ascii="Arial" w:hAnsi="Arial"/>
+                <w:b/>
+                <w:color w:val="2E7D32"/>
+                <w:sz w:val="20"/>
+              </w:rPr>
+              <w:t>0.662</w:t>
             </w:r>
           </w:p>
         </w:tc>
@@ -358,48 +358,67 @@
       <w:tr>
         <w:tc>
           <w:tcPr>
-            <w:tcW w:type="dxa" w:w="4680"/>
-            <w:tcBorders>
-              <w:top w:val="single" w:sz="4" w:color="CCCCCC"/>
-              <w:bottom w:val="single" w:sz="4" w:color="CCCCCC"/>
-              <w:left w:val="single" w:sz="4" w:color="CCCCCC"/>
-              <w:right w:val="single" w:sz="4" w:color="CCCCCC"/>
-            </w:tcBorders>
-            <w:vAlign w:val="center"/>
-          </w:tcPr>
-          <w:p>
-            <w:r/>
-            <w:r>
-              <w:rPr>
-                <w:rFonts w:ascii="Arial" w:hAnsi="Arial"/>
-                <w:sz w:val="20"/>
-              </w:rPr>
-              <w:t>RMSE</w:t>
-            </w:r>
-          </w:p>
-        </w:tc>
-        <w:tc>
-          <w:tcPr>
-            <w:tcW w:type="dxa" w:w="4680"/>
-            <w:tcBorders>
-              <w:top w:val="single" w:sz="4" w:color="CCCCCC"/>
-              <w:bottom w:val="single" w:sz="4" w:color="CCCCCC"/>
-              <w:left w:val="single" w:sz="4" w:color="CCCCCC"/>
-              <w:right w:val="single" w:sz="4" w:color="CCCCCC"/>
-            </w:tcBorders>
-            <w:vAlign w:val="center"/>
-          </w:tcPr>
-          <w:p>
-            <w:pPr>
-              <w:jc w:val="center"/>
-            </w:pPr>
-            <w:r/>
-            <w:r>
-              <w:rPr>
-                <w:rFonts w:ascii="Arial" w:hAnsi="Arial"/>
-                <w:sz w:val="20"/>
-              </w:rPr>
-              <w:t>0.042</w:t>
+            <w:tcW w:type="dxa" w:w="3120"/>
+            <w:tcBorders>
+              <w:top w:val="single" w:sz="4" w:color="CCCCCC"/>
+              <w:bottom w:val="single" w:sz="4" w:color="CCCCCC"/>
+              <w:left w:val="single" w:sz="4" w:color="CCCCCC"/>
+              <w:right w:val="single" w:sz="4" w:color="CCCCCC"/>
+            </w:tcBorders>
+            <w:vAlign w:val="center"/>
+          </w:tcPr>
+          <w:p>
+            <w:r/>
+            <w:r>
+              <w:rPr>
+                <w:rFonts w:ascii="Arial" w:hAnsi="Arial"/>
+                <w:sz w:val="20"/>
+              </w:rPr>
+              <w:t>Decline (V5.1)</w:t>
+            </w:r>
+          </w:p>
+        </w:tc>
+        <w:tc>
+          <w:tcPr>
+            <w:tcW w:type="dxa" w:w="3120"/>
+            <w:tcBorders>
+              <w:top w:val="single" w:sz="4" w:color="CCCCCC"/>
+              <w:bottom w:val="single" w:sz="4" w:color="CCCCCC"/>
+              <w:left w:val="single" w:sz="4" w:color="CCCCCC"/>
+              <w:right w:val="single" w:sz="4" w:color="CCCCCC"/>
+            </w:tcBorders>
+            <w:vAlign w:val="center"/>
+          </w:tcPr>
+          <w:p>
+            <w:r/>
+            <w:r>
+              <w:rPr>
+                <w:rFonts w:ascii="Arial" w:hAnsi="Arial"/>
+                <w:sz w:val="20"/>
+              </w:rPr>
+              <w:t>Aker BP treffrate (±0.05)</w:t>
+            </w:r>
+          </w:p>
+        </w:tc>
+        <w:tc>
+          <w:tcPr>
+            <w:tcW w:type="dxa" w:w="3120"/>
+            <w:tcBorders>
+              <w:top w:val="single" w:sz="4" w:color="CCCCCC"/>
+              <w:bottom w:val="single" w:sz="4" w:color="CCCCCC"/>
+              <w:left w:val="single" w:sz="4" w:color="CCCCCC"/>
+              <w:right w:val="single" w:sz="4" w:color="CCCCCC"/>
+            </w:tcBorders>
+            <w:vAlign w:val="center"/>
+          </w:tcPr>
+          <w:p>
+            <w:r/>
+            <w:r>
+              <w:rPr>
+                <w:rFonts w:ascii="Arial" w:hAnsi="Arial"/>
+                <w:sz w:val="20"/>
+              </w:rPr>
+              <w:t>83% [55-95% CI]</w:t>
             </w:r>
           </w:p>
         </w:tc>
@@ -407,41 +426,61 @@
       <w:tr>
         <w:tc>
           <w:tcPr>
-            <w:tcW w:type="dxa" w:w="4680"/>
-            <w:tcBorders>
-              <w:top w:val="single" w:sz="4" w:color="CCCCCC"/>
-              <w:bottom w:val="single" w:sz="4" w:color="CCCCCC"/>
-              <w:left w:val="single" w:sz="4" w:color="CCCCCC"/>
-              <w:right w:val="single" w:sz="4" w:color="CCCCCC"/>
-            </w:tcBorders>
-            <w:vAlign w:val="center"/>
-          </w:tcPr>
-          <w:p>
-            <w:r/>
-            <w:r>
-              <w:rPr>
-                <w:rFonts w:ascii="Arial" w:hAnsi="Arial"/>
-                <w:sz w:val="20"/>
-              </w:rPr>
-              <w:t>NCS-felt med reservoar-API</w:t>
-            </w:r>
-          </w:p>
-        </w:tc>
-        <w:tc>
-          <w:tcPr>
-            <w:tcW w:type="dxa" w:w="4680"/>
-            <w:tcBorders>
-              <w:top w:val="single" w:sz="4" w:color="CCCCCC"/>
-              <w:bottom w:val="single" w:sz="4" w:color="CCCCCC"/>
-              <w:left w:val="single" w:sz="4" w:color="CCCCCC"/>
-              <w:right w:val="single" w:sz="4" w:color="CCCCCC"/>
-            </w:tcBorders>
-            <w:vAlign w:val="center"/>
-          </w:tcPr>
-          <w:p>
-            <w:pPr>
-              <w:jc w:val="center"/>
-            </w:pPr>
+            <w:tcW w:type="dxa" w:w="3120"/>
+            <w:tcBorders>
+              <w:top w:val="single" w:sz="4" w:color="CCCCCC"/>
+              <w:bottom w:val="single" w:sz="4" w:color="CCCCCC"/>
+              <w:left w:val="single" w:sz="4" w:color="CCCCCC"/>
+              <w:right w:val="single" w:sz="4" w:color="CCCCCC"/>
+            </w:tcBorders>
+            <w:vAlign w:val="center"/>
+          </w:tcPr>
+          <w:p>
+            <w:r/>
+            <w:r>
+              <w:rPr>
+                <w:rFonts w:ascii="Arial" w:hAnsi="Arial"/>
+                <w:b/>
+                <w:sz w:val="20"/>
+              </w:rPr>
+              <w:t>Pre-peak forecast</w:t>
+            </w:r>
+          </w:p>
+        </w:tc>
+        <w:tc>
+          <w:tcPr>
+            <w:tcW w:type="dxa" w:w="3120"/>
+            <w:tcBorders>
+              <w:top w:val="single" w:sz="4" w:color="CCCCCC"/>
+              <w:bottom w:val="single" w:sz="4" w:color="CCCCCC"/>
+              <w:left w:val="single" w:sz="4" w:color="CCCCCC"/>
+              <w:right w:val="single" w:sz="4" w:color="CCCCCC"/>
+            </w:tcBorders>
+            <w:vAlign w:val="center"/>
+          </w:tcPr>
+          <w:p>
+            <w:r/>
+            <w:r>
+              <w:rPr>
+                <w:rFonts w:ascii="Arial" w:hAnsi="Arial"/>
+                <w:sz w:val="20"/>
+              </w:rPr>
+              <w:t>Ramp/platå (out-of-sample)</w:t>
+            </w:r>
+          </w:p>
+        </w:tc>
+        <w:tc>
+          <w:tcPr>
+            <w:tcW w:type="dxa" w:w="3120"/>
+            <w:tcBorders>
+              <w:top w:val="single" w:sz="4" w:color="CCCCCC"/>
+              <w:bottom w:val="single" w:sz="4" w:color="CCCCCC"/>
+              <w:left w:val="single" w:sz="4" w:color="CCCCCC"/>
+              <w:right w:val="single" w:sz="4" w:color="CCCCCC"/>
+            </w:tcBorders>
+            <w:vAlign w:val="center"/>
+          </w:tcPr>
+          <w:p>
             <w:r/>
             <w:r>
               <w:rPr>
@@ -450,7 +489,7 @@
                 <w:color w:val="2E7D32"/>
                 <w:sz w:val="20"/>
               </w:rPr>
-              <w:t>31 av 48</w:t>
+              <w:t>±5/±4 mnd</w:t>
             </w:r>
           </w:p>
         </w:tc>
@@ -458,48 +497,68 @@
       <w:tr>
         <w:tc>
           <w:tcPr>
-            <w:tcW w:type="dxa" w:w="4680"/>
-            <w:tcBorders>
-              <w:top w:val="single" w:sz="4" w:color="CCCCCC"/>
-              <w:bottom w:val="single" w:sz="4" w:color="CCCCCC"/>
-              <w:left w:val="single" w:sz="4" w:color="CCCCCC"/>
-              <w:right w:val="single" w:sz="4" w:color="CCCCCC"/>
-            </w:tcBorders>
-            <w:vAlign w:val="center"/>
-          </w:tcPr>
-          <w:p>
-            <w:r/>
-            <w:r>
-              <w:rPr>
-                <w:rFonts w:ascii="Arial" w:hAnsi="Arial"/>
-                <w:sz w:val="20"/>
-              </w:rPr>
-              <w:t>Felt med felt-spesifikk reservoartemperatur</w:t>
-            </w:r>
-          </w:p>
-        </w:tc>
-        <w:tc>
-          <w:tcPr>
-            <w:tcW w:type="dxa" w:w="4680"/>
-            <w:tcBorders>
-              <w:top w:val="single" w:sz="4" w:color="CCCCCC"/>
-              <w:bottom w:val="single" w:sz="4" w:color="CCCCCC"/>
-              <w:left w:val="single" w:sz="4" w:color="CCCCCC"/>
-              <w:right w:val="single" w:sz="4" w:color="CCCCCC"/>
-            </w:tcBorders>
-            <w:vAlign w:val="center"/>
-          </w:tcPr>
-          <w:p>
-            <w:pPr>
-              <w:jc w:val="center"/>
-            </w:pPr>
-            <w:r/>
-            <w:r>
-              <w:rPr>
-                <w:rFonts w:ascii="Arial" w:hAnsi="Arial"/>
-                <w:sz w:val="20"/>
-              </w:rPr>
-              <w:t>15</w:t>
+            <w:tcW w:type="dxa" w:w="3120"/>
+            <w:tcBorders>
+              <w:top w:val="single" w:sz="4" w:color="CCCCCC"/>
+              <w:bottom w:val="single" w:sz="4" w:color="CCCCCC"/>
+              <w:left w:val="single" w:sz="4" w:color="CCCCCC"/>
+              <w:right w:val="single" w:sz="4" w:color="CCCCCC"/>
+            </w:tcBorders>
+            <w:vAlign w:val="center"/>
+          </w:tcPr>
+          <w:p>
+            <w:r/>
+            <w:r>
+              <w:rPr>
+                <w:rFonts w:ascii="Arial" w:hAnsi="Arial"/>
+                <w:sz w:val="20"/>
+              </w:rPr>
+              <w:t>Pre-peak forecast</w:t>
+            </w:r>
+          </w:p>
+        </w:tc>
+        <w:tc>
+          <w:tcPr>
+            <w:tcW w:type="dxa" w:w="3120"/>
+            <w:tcBorders>
+              <w:top w:val="single" w:sz="4" w:color="CCCCCC"/>
+              <w:bottom w:val="single" w:sz="4" w:color="CCCCCC"/>
+              <w:left w:val="single" w:sz="4" w:color="CCCCCC"/>
+              <w:right w:val="single" w:sz="4" w:color="CCCCCC"/>
+            </w:tcBorders>
+            <w:vAlign w:val="center"/>
+          </w:tcPr>
+          <w:p>
+            <w:r/>
+            <w:r>
+              <w:rPr>
+                <w:rFonts w:ascii="Arial" w:hAnsi="Arial"/>
+                <w:sz w:val="20"/>
+              </w:rPr>
+              <w:t>Peak (out-of-sample)</w:t>
+            </w:r>
+          </w:p>
+        </w:tc>
+        <w:tc>
+          <w:tcPr>
+            <w:tcW w:type="dxa" w:w="3120"/>
+            <w:tcBorders>
+              <w:top w:val="single" w:sz="4" w:color="CCCCCC"/>
+              <w:bottom w:val="single" w:sz="4" w:color="CCCCCC"/>
+              <w:left w:val="single" w:sz="4" w:color="CCCCCC"/>
+              <w:right w:val="single" w:sz="4" w:color="CCCCCC"/>
+            </w:tcBorders>
+            <w:vAlign w:val="center"/>
+          </w:tcPr>
+          <w:p>
+            <w:r/>
+            <w:r>
+              <w:rPr>
+                <w:rFonts w:ascii="Arial" w:hAnsi="Arial"/>
+                <w:color w:val="E65100"/>
+                <w:sz w:val="20"/>
+              </w:rPr>
+              <w:t>±35% (range)</w:t>
             </w:r>
           </w:p>
         </w:tc>
@@ -507,48 +566,67 @@
       <w:tr>
         <w:tc>
           <w:tcPr>
-            <w:tcW w:type="dxa" w:w="4680"/>
-            <w:tcBorders>
-              <w:top w:val="single" w:sz="4" w:color="CCCCCC"/>
-              <w:bottom w:val="single" w:sz="4" w:color="CCCCCC"/>
-              <w:left w:val="single" w:sz="4" w:color="CCCCCC"/>
-              <w:right w:val="single" w:sz="4" w:color="CCCCCC"/>
-            </w:tcBorders>
-            <w:vAlign w:val="center"/>
-          </w:tcPr>
-          <w:p>
-            <w:r/>
-            <w:r>
-              <w:rPr>
-                <w:rFonts w:ascii="Arial" w:hAnsi="Arial"/>
-                <w:sz w:val="20"/>
-              </w:rPr>
-              <w:t>Aker BP MAE</w:t>
-            </w:r>
-          </w:p>
-        </w:tc>
-        <w:tc>
-          <w:tcPr>
-            <w:tcW w:type="dxa" w:w="4680"/>
-            <w:tcBorders>
-              <w:top w:val="single" w:sz="4" w:color="CCCCCC"/>
-              <w:bottom w:val="single" w:sz="4" w:color="CCCCCC"/>
-              <w:left w:val="single" w:sz="4" w:color="CCCCCC"/>
-              <w:right w:val="single" w:sz="4" w:color="CCCCCC"/>
-            </w:tcBorders>
-            <w:vAlign w:val="center"/>
-          </w:tcPr>
-          <w:p>
-            <w:pPr>
-              <w:jc w:val="center"/>
-            </w:pPr>
-            <w:r/>
-            <w:r>
-              <w:rPr>
-                <w:rFonts w:ascii="Arial" w:hAnsi="Arial"/>
-                <w:sz w:val="20"/>
-              </w:rPr>
-              <w:t>0.040</w:t>
+            <w:tcW w:type="dxa" w:w="3120"/>
+            <w:tcBorders>
+              <w:top w:val="single" w:sz="4" w:color="CCCCCC"/>
+              <w:bottom w:val="single" w:sz="4" w:color="CCCCCC"/>
+              <w:left w:val="single" w:sz="4" w:color="CCCCCC"/>
+              <w:right w:val="single" w:sz="4" w:color="CCCCCC"/>
+            </w:tcBorders>
+            <w:vAlign w:val="center"/>
+          </w:tcPr>
+          <w:p>
+            <w:r/>
+            <w:r>
+              <w:rPr>
+                <w:rFonts w:ascii="Arial" w:hAnsi="Arial"/>
+                <w:sz w:val="20"/>
+              </w:rPr>
+              <w:t>Datagrunnlag</w:t>
+            </w:r>
+          </w:p>
+        </w:tc>
+        <w:tc>
+          <w:tcPr>
+            <w:tcW w:type="dxa" w:w="3120"/>
+            <w:tcBorders>
+              <w:top w:val="single" w:sz="4" w:color="CCCCCC"/>
+              <w:bottom w:val="single" w:sz="4" w:color="CCCCCC"/>
+              <w:left w:val="single" w:sz="4" w:color="CCCCCC"/>
+              <w:right w:val="single" w:sz="4" w:color="CCCCCC"/>
+            </w:tcBorders>
+            <w:vAlign w:val="center"/>
+          </w:tcPr>
+          <w:p>
+            <w:r/>
+            <w:r>
+              <w:rPr>
+                <w:rFonts w:ascii="Arial" w:hAnsi="Arial"/>
+                <w:sz w:val="20"/>
+              </w:rPr>
+              <w:t>Master fluid library</w:t>
+            </w:r>
+          </w:p>
+        </w:tc>
+        <w:tc>
+          <w:tcPr>
+            <w:tcW w:type="dxa" w:w="3120"/>
+            <w:tcBorders>
+              <w:top w:val="single" w:sz="4" w:color="CCCCCC"/>
+              <w:bottom w:val="single" w:sz="4" w:color="CCCCCC"/>
+              <w:left w:val="single" w:sz="4" w:color="CCCCCC"/>
+              <w:right w:val="single" w:sz="4" w:color="CCCCCC"/>
+            </w:tcBorders>
+            <w:vAlign w:val="center"/>
+          </w:tcPr>
+          <w:p>
+            <w:r/>
+            <w:r>
+              <w:rPr>
+                <w:rFonts w:ascii="Arial" w:hAnsi="Arial"/>
+                <w:sz w:val="20"/>
+              </w:rPr>
+              <w:t>108 felt</w:t>
             </w:r>
           </w:p>
         </w:tc>
@@ -556,50 +634,67 @@
       <w:tr>
         <w:tc>
           <w:tcPr>
-            <w:tcW w:type="dxa" w:w="4680"/>
-            <w:tcBorders>
-              <w:top w:val="single" w:sz="4" w:color="CCCCCC"/>
-              <w:bottom w:val="single" w:sz="4" w:color="CCCCCC"/>
-              <w:left w:val="single" w:sz="4" w:color="CCCCCC"/>
-              <w:right w:val="single" w:sz="4" w:color="CCCCCC"/>
-            </w:tcBorders>
-            <w:vAlign w:val="center"/>
-          </w:tcPr>
-          <w:p>
-            <w:r/>
-            <w:r>
-              <w:rPr>
-                <w:rFonts w:ascii="Arial" w:hAnsi="Arial"/>
-                <w:sz w:val="20"/>
-              </w:rPr>
-              <w:t>Aker BP treffrate (±0.05)</w:t>
-            </w:r>
-          </w:p>
-        </w:tc>
-        <w:tc>
-          <w:tcPr>
-            <w:tcW w:type="dxa" w:w="4680"/>
-            <w:tcBorders>
-              <w:top w:val="single" w:sz="4" w:color="CCCCCC"/>
-              <w:bottom w:val="single" w:sz="4" w:color="CCCCCC"/>
-              <w:left w:val="single" w:sz="4" w:color="CCCCCC"/>
-              <w:right w:val="single" w:sz="4" w:color="CCCCCC"/>
-            </w:tcBorders>
-            <w:vAlign w:val="center"/>
-          </w:tcPr>
-          <w:p>
-            <w:pPr>
-              <w:jc w:val="center"/>
-            </w:pPr>
-            <w:r/>
-            <w:r>
-              <w:rPr>
-                <w:rFonts w:ascii="Arial" w:hAnsi="Arial"/>
-                <w:b/>
-                <w:color w:val="2E7D32"/>
-                <w:sz w:val="20"/>
-              </w:rPr>
-              <w:t>83% [55-95% CI]</w:t>
+            <w:tcW w:type="dxa" w:w="3120"/>
+            <w:tcBorders>
+              <w:top w:val="single" w:sz="4" w:color="CCCCCC"/>
+              <w:bottom w:val="single" w:sz="4" w:color="CCCCCC"/>
+              <w:left w:val="single" w:sz="4" w:color="CCCCCC"/>
+              <w:right w:val="single" w:sz="4" w:color="CCCCCC"/>
+            </w:tcBorders>
+            <w:vAlign w:val="center"/>
+          </w:tcPr>
+          <w:p>
+            <w:r/>
+            <w:r>
+              <w:rPr>
+                <w:rFonts w:ascii="Arial" w:hAnsi="Arial"/>
+                <w:sz w:val="20"/>
+              </w:rPr>
+              <w:t>Datagrunnlag</w:t>
+            </w:r>
+          </w:p>
+        </w:tc>
+        <w:tc>
+          <w:tcPr>
+            <w:tcW w:type="dxa" w:w="3120"/>
+            <w:tcBorders>
+              <w:top w:val="single" w:sz="4" w:color="CCCCCC"/>
+              <w:bottom w:val="single" w:sz="4" w:color="CCCCCC"/>
+              <w:left w:val="single" w:sz="4" w:color="CCCCCC"/>
+              <w:right w:val="single" w:sz="4" w:color="CCCCCC"/>
+            </w:tcBorders>
+            <w:vAlign w:val="center"/>
+          </w:tcPr>
+          <w:p>
+            <w:r/>
+            <w:r>
+              <w:rPr>
+                <w:rFonts w:ascii="Arial" w:hAnsi="Arial"/>
+                <w:sz w:val="20"/>
+              </w:rPr>
+              <w:t>Type-curve bibliotek</w:t>
+            </w:r>
+          </w:p>
+        </w:tc>
+        <w:tc>
+          <w:tcPr>
+            <w:tcW w:type="dxa" w:w="3120"/>
+            <w:tcBorders>
+              <w:top w:val="single" w:sz="4" w:color="CCCCCC"/>
+              <w:bottom w:val="single" w:sz="4" w:color="CCCCCC"/>
+              <w:left w:val="single" w:sz="4" w:color="CCCCCC"/>
+              <w:right w:val="single" w:sz="4" w:color="CCCCCC"/>
+            </w:tcBorders>
+            <w:vAlign w:val="center"/>
+          </w:tcPr>
+          <w:p>
+            <w:r/>
+            <w:r>
+              <w:rPr>
+                <w:rFonts w:ascii="Arial" w:hAnsi="Arial"/>
+                <w:sz w:val="20"/>
+              </w:rPr>
+              <w:t>69 felt</w:t>
             </w:r>
           </w:p>
         </w:tc>
@@ -633,7 +728,7 @@
           <w:rFonts w:ascii="Arial" w:hAnsi="Arial"/>
           <w:sz w:val="22"/>
         </w:rPr>
-        <w:t>Dette dokumentet beskriver en kvantitativ modell (V5) for å estimere årlige decline rates (D_annual) for olje- og gassfelt på norsk sokkel. Modellen kombinerer fire elementer:</w:t>
+        <w:t>Dette dokumentet beskriver et komplett produksjons-forecasting-rammeverk for norsk sokkel, bygget rundt to komplementære motorer:</w:t>
       </w:r>
     </w:p>
     <w:p>
@@ -646,7 +741,7 @@
           <w:rFonts w:ascii="Arial" w:hAnsi="Arial"/>
           <w:sz w:val="22"/>
         </w:rPr>
-        <w:t>Fysikk-baseline: Beggs-Robinson viskositet beregnet fra API gravity</w:t>
+        <w:t>Decline-modell (V5.1) — for felt med ≥12 måneders produksjonshistorikk. Estimerer årlig decline rate fra fysikk (Beggs-Robinson viskositet) + et feltspesifikt premium-rammeverk. Seksjon 2-10.</w:t>
       </w:r>
     </w:p>
     <w:p>
@@ -659,70 +754,19 @@
           <w:rFonts w:ascii="Arial" w:hAnsi="Arial"/>
           <w:sz w:val="22"/>
         </w:rPr>
-        <w:t>Reservoar-API: ekte reservoarmålinger fra Sodir DST-database og operatør-research (110 felt)</w:t>
+        <w:t>Pre-peak forecast (V2) — for helt nye felt, fra PDO-data alene. Predikerer peak / ramp / platå / decline fra kun ex-ante variabler. Seksjon 11-13.</w:t>
       </w:r>
     </w:p>
     <w:p>
       <w:pPr>
-        <w:pStyle w:val="ListBullet"/>
-        <w:spacing w:before="40" w:after="40"/>
+        <w:spacing w:before="80" w:after="80"/>
       </w:pPr>
       <w:r>
         <w:rPr>
           <w:rFonts w:ascii="Arial" w:hAnsi="Arial"/>
           <w:sz w:val="22"/>
         </w:rPr>
-        <w:t>Felt-spesifikk reservoartemperatur: brukt der målinger finnes (10 felt)</w:t>
-      </w:r>
-    </w:p>
-    <w:p>
-      <w:pPr>
-        <w:pStyle w:val="ListBullet"/>
-        <w:spacing w:before="40" w:after="40"/>
-      </w:pPr>
-      <w:r>
-        <w:rPr>
-          <w:rFonts w:ascii="Arial" w:hAnsi="Arial"/>
-          <w:sz w:val="22"/>
-        </w:rPr>
-        <w:t>Historisk premium: feltets faktiske avvik fra fysikk-prediksjonen siste 12 måneder</w:t>
-      </w:r>
-    </w:p>
-    <w:p>
-      <w:pPr>
-        <w:pStyle w:val="ListBullet"/>
-        <w:spacing w:before="40" w:after="40"/>
-      </w:pPr>
-      <w:r>
-        <w:rPr>
-          <w:rFonts w:ascii="Arial" w:hAnsi="Arial"/>
-          <w:sz w:val="22"/>
-        </w:rPr>
-        <w:t>Asymmetri-korreksjon: justering for felt som avviker mye fra fysikken (uansett retning)</w:t>
-      </w:r>
-    </w:p>
-    <w:p>
-      <w:pPr>
-        <w:spacing w:before="80" w:after="80"/>
-      </w:pPr>
-      <w:r>
-        <w:rPr>
-          <w:rFonts w:ascii="Arial" w:hAnsi="Arial"/>
-          <w:sz w:val="22"/>
-        </w:rPr>
-        <w:t>Versjon 2 av modellen bruker reservoar-API i stedet for handelsblending-API for 31 av 49 felt der vi har høy/medium konfidens på reservoarmålinger. Dette er en mer ærlig modellering selv om presisjonen er marginalt lavere — modellen er nå mer generaliserbar og fysisk korrekt.</w:t>
-      </w:r>
-    </w:p>
-    <w:p>
-      <w:pPr>
-        <w:spacing w:before="80" w:after="80"/>
-      </w:pPr>
-      <w:r>
-        <w:rPr>
-          <w:rFonts w:ascii="Arial" w:hAnsi="Arial"/>
-          <w:sz w:val="22"/>
-        </w:rPr>
-        <w:t>Modellen oppnår ærlig nested CV R² = 0.662 og Aker BP treffrate på 83% (innen ±0.05). Alle inputs er offentlig tilgjengelige fra Sodir og operatør-rapporter.</w:t>
+        <w:t>Sammen dekker de hele feltets livssyklus: fra førsteolje (pre-peak forecast) til moden produksjon (decline-modell). For et nytt felt brukes pre-peak forecast til feltet har 12 måneders historikk, deretter tar den mer presise decline-modellen over.</w:t>
       </w:r>
     </w:p>
     <w:p>
@@ -735,7 +779,19 @@
           <w:b/>
           <w:sz w:val="22"/>
         </w:rPr>
-        <w:t>Den endelige formelen er:</w:t>
+        <w:t>DECLINE-MODELLEN (V5.1):</w:t>
+      </w:r>
+    </w:p>
+    <w:p>
+      <w:pPr>
+        <w:spacing w:before="80" w:after="80"/>
+      </w:pPr>
+      <w:r>
+        <w:rPr>
+          <w:rFonts w:ascii="Arial" w:hAnsi="Arial"/>
+          <w:sz w:val="22"/>
+        </w:rPr>
+        <w:t>Bruker reservoar-API fra Sodir DST og operatør-research i stedet for handelsblending-API. Oppnår ærlig nested CV R² = 0.662 og Aker BP treffrate 83% (innen ±0.05). Alle inputs offentlig tilgjengelige.</w:t>
       </w:r>
     </w:p>
     <w:p>
@@ -750,7 +806,32 @@
           <w:color w:val="1F4E79"/>
           <w:sz w:val="24"/>
         </w:rPr>
-        <w:t>D = 0.0939 + 0.0114·ln(viskositet) − 0.0611·P₁₂ + 0.0401·|P₁₂|</w:t>
+        <w:t>D = 0.0938 + 0.0106·ln(viskositet) − 0.0612·P₁₂ + 0.0399·|P₁₂|</w:t>
+      </w:r>
+    </w:p>
+    <w:p>
+      <w:pPr>
+        <w:spacing w:before="80" w:after="80"/>
+      </w:pPr>
+      <w:r>
+        <w:rPr>
+          <w:rFonts w:ascii="Arial" w:hAnsi="Arial"/>
+          <w:b/>
+          <w:sz w:val="22"/>
+        </w:rPr>
+        <w:t>PRE-PEAK FORECAST (V2):</w:t>
+      </w:r>
+    </w:p>
+    <w:p>
+      <w:pPr>
+        <w:spacing w:before="80" w:after="80"/>
+      </w:pPr>
+      <w:r>
+        <w:rPr>
+          <w:rFonts w:ascii="Arial" w:hAnsi="Arial"/>
+          <w:sz w:val="22"/>
+        </w:rPr>
+        <w:t>Predikerer ramp/platå presist (±5/±4 mnd out-of-sample), peak som range-verktøy (±35%). Validert med ekte hold-out test der modellen aldri så testfeltet. Brukt på Yggdrasil som case study (seksjon 13).</w:t>
       </w:r>
     </w:p>
     <w:p>
@@ -10434,6 +10515,2315 @@
           <w:color w:val="1F4E79"/>
           <w:sz w:val="32"/>
         </w:rPr>
+        <w:t>11. Pre-peak forecasting — produksjon for nye felt</w:t>
+      </w:r>
+    </w:p>
+    <w:p>
+      <w:pPr>
+        <w:spacing w:before="80" w:after="80"/>
+      </w:pPr>
+      <w:r>
+        <w:rPr>
+          <w:rFonts w:ascii="Arial" w:hAnsi="Arial"/>
+          <w:sz w:val="22"/>
+        </w:rPr>
+        <w:t>Decline-modellen (seksjon 1-10) krever minst 12 måneders produksjonshistorikk for å beregne premium. For helt nye felt — som ennå ikke produserer — trenger vi et eget rammeverk som forecaster fra data tilgjengelig FØR produksjon (PDO og discovery DST).</w:t>
+      </w:r>
+    </w:p>
+    <w:p>
+      <w:pPr>
+        <w:spacing w:before="80" w:after="80"/>
+      </w:pPr>
+      <w:r>
+        <w:rPr>
+          <w:rFonts w:ascii="Arial" w:hAnsi="Arial"/>
+          <w:sz w:val="22"/>
+        </w:rPr>
+        <w:t>Dette er en fundamentalt annen modelleringsoppgave. For modne felt er decline det eneste ukjente. For nye felt har vi fire ukjente som alle påvirker NPV:</w:t>
+      </w:r>
+    </w:p>
+    <w:p>
+      <w:pPr>
+        <w:pStyle w:val="ListBullet"/>
+        <w:spacing w:before="40" w:after="40"/>
+      </w:pPr>
+      <w:r>
+        <w:rPr>
+          <w:rFonts w:ascii="Arial" w:hAnsi="Arial"/>
+          <w:sz w:val="22"/>
+        </w:rPr>
+        <w:t>Peak-rate — hvor høyt produksjonen topper</w:t>
+      </w:r>
+    </w:p>
+    <w:p>
+      <w:pPr>
+        <w:pStyle w:val="ListBullet"/>
+        <w:spacing w:before="40" w:after="40"/>
+      </w:pPr>
+      <w:r>
+        <w:rPr>
+          <w:rFonts w:ascii="Arial" w:hAnsi="Arial"/>
+          <w:sz w:val="22"/>
+        </w:rPr>
+        <w:t>Ramp-up tid — fra førsteolje til peak</w:t>
+      </w:r>
+    </w:p>
+    <w:p>
+      <w:pPr>
+        <w:pStyle w:val="ListBullet"/>
+        <w:spacing w:before="40" w:after="40"/>
+      </w:pPr>
+      <w:r>
+        <w:rPr>
+          <w:rFonts w:ascii="Arial" w:hAnsi="Arial"/>
+          <w:sz w:val="22"/>
+        </w:rPr>
+        <w:t>Platå-lengde — hvor lenge peak holder seg</w:t>
+      </w:r>
+    </w:p>
+    <w:p>
+      <w:pPr>
+        <w:pStyle w:val="ListBullet"/>
+        <w:spacing w:before="40" w:after="40"/>
+      </w:pPr>
+      <w:r>
+        <w:rPr>
+          <w:rFonts w:ascii="Arial" w:hAnsi="Arial"/>
+          <w:sz w:val="22"/>
+        </w:rPr>
+        <w:t>Decline-rate — fallet etter platå</w:t>
+      </w:r>
+    </w:p>
+    <w:p>
+      <w:pPr>
+        <w:spacing w:before="280" w:after="160"/>
+      </w:pPr>
+      <w:r>
+        <w:rPr>
+          <w:rFonts w:ascii="Arial" w:hAnsi="Arial"/>
+          <w:b/>
+          <w:color w:val="1F4E79"/>
+          <w:sz w:val="26"/>
+        </w:rPr>
+        <w:t>11.1 Kun ex-ante variabler</w:t>
+      </w:r>
+    </w:p>
+    <w:p>
+      <w:pPr>
+        <w:spacing w:before="80" w:after="80"/>
+      </w:pPr>
+      <w:r>
+        <w:rPr>
+          <w:rFonts w:ascii="Arial" w:hAnsi="Arial"/>
+          <w:sz w:val="22"/>
+        </w:rPr>
+        <w:t>Et avgjørende metodisk prinsipp: forecast-modellen bruker KUN variabler kjent før feltet starter produksjon. Det er fristende å inkludere variabler som forbedrer historisk fit, men hvis de ikke er kjent på forhånd er de ubrukelige for en ekte prognose.</w:t>
+      </w:r>
+    </w:p>
+    <w:tbl>
+      <w:tblPr>
+        <w:tblW w:type="auto" w:w="0"/>
+        <w:jc w:val="center"/>
+        <w:tblLook w:firstColumn="1" w:firstRow="1" w:lastColumn="0" w:lastRow="0" w:noHBand="0" w:noVBand="1" w:val="04A0"/>
+      </w:tblPr>
+      <w:tblGrid>
+        <w:gridCol w:w="4680"/>
+        <w:gridCol w:w="4680"/>
+      </w:tblGrid>
+      <w:tr>
+        <w:tc>
+          <w:tcPr>
+            <w:tcW w:type="dxa" w:w="4752"/>
+            <w:shd w:fill="1F4E79" w:val="clear"/>
+            <w:tcBorders>
+              <w:top w:val="single" w:sz="4" w:color="CCCCCC"/>
+              <w:bottom w:val="single" w:sz="4" w:color="CCCCCC"/>
+              <w:left w:val="single" w:sz="4" w:color="CCCCCC"/>
+              <w:right w:val="single" w:sz="4" w:color="CCCCCC"/>
+            </w:tcBorders>
+            <w:vAlign w:val="center"/>
+          </w:tcPr>
+          <w:p>
+            <w:pPr>
+              <w:jc w:val="center"/>
+            </w:pPr>
+            <w:r/>
+            <w:r>
+              <w:rPr>
+                <w:rFonts w:ascii="Arial" w:hAnsi="Arial"/>
+                <w:b/>
+                <w:color w:val="FFFFFF"/>
+                <w:sz w:val="20"/>
+              </w:rPr>
+              <w:t>✓ Tilgjengelig før produksjon</w:t>
+            </w:r>
+          </w:p>
+        </w:tc>
+        <w:tc>
+          <w:tcPr>
+            <w:tcW w:type="dxa" w:w="4752"/>
+            <w:shd w:fill="1F4E79" w:val="clear"/>
+            <w:tcBorders>
+              <w:top w:val="single" w:sz="4" w:color="CCCCCC"/>
+              <w:bottom w:val="single" w:sz="4" w:color="CCCCCC"/>
+              <w:left w:val="single" w:sz="4" w:color="CCCCCC"/>
+              <w:right w:val="single" w:sz="4" w:color="CCCCCC"/>
+            </w:tcBorders>
+            <w:vAlign w:val="center"/>
+          </w:tcPr>
+          <w:p>
+            <w:pPr>
+              <w:jc w:val="center"/>
+            </w:pPr>
+            <w:r/>
+            <w:r>
+              <w:rPr>
+                <w:rFonts w:ascii="Arial" w:hAnsi="Arial"/>
+                <w:b/>
+                <w:color w:val="FFFFFF"/>
+                <w:sz w:val="20"/>
+              </w:rPr>
+              <w:t>✗ IKKE tilgjengelig (ekskludert)</w:t>
+            </w:r>
+          </w:p>
+        </w:tc>
+      </w:tr>
+      <w:tr>
+        <w:tc>
+          <w:tcPr>
+            <w:tcW w:type="dxa" w:w="4680"/>
+            <w:tcBorders>
+              <w:top w:val="single" w:sz="4" w:color="CCCCCC"/>
+              <w:bottom w:val="single" w:sz="4" w:color="CCCCCC"/>
+              <w:left w:val="single" w:sz="4" w:color="CCCCCC"/>
+              <w:right w:val="single" w:sz="4" w:color="CCCCCC"/>
+            </w:tcBorders>
+            <w:vAlign w:val="center"/>
+          </w:tcPr>
+          <w:p>
+            <w:r/>
+            <w:r>
+              <w:rPr>
+                <w:rFonts w:ascii="Arial" w:hAnsi="Arial"/>
+                <w:sz w:val="20"/>
+              </w:rPr>
+              <w:t>Recoverable reserves (PDO-anslag)</w:t>
+            </w:r>
+          </w:p>
+        </w:tc>
+        <w:tc>
+          <w:tcPr>
+            <w:tcW w:type="dxa" w:w="4680"/>
+            <w:tcBorders>
+              <w:top w:val="single" w:sz="4" w:color="CCCCCC"/>
+              <w:bottom w:val="single" w:sz="4" w:color="CCCCCC"/>
+              <w:left w:val="single" w:sz="4" w:color="CCCCCC"/>
+              <w:right w:val="single" w:sz="4" w:color="CCCCCC"/>
+            </w:tcBorders>
+            <w:vAlign w:val="center"/>
+          </w:tcPr>
+          <w:p>
+            <w:r/>
+            <w:r>
+              <w:rPr>
+                <w:rFonts w:ascii="Arial" w:hAnsi="Arial"/>
+                <w:sz w:val="20"/>
+              </w:rPr>
+              <w:t>Faktisk kumulativ produksjon</w:t>
+            </w:r>
+          </w:p>
+        </w:tc>
+      </w:tr>
+      <w:tr>
+        <w:tc>
+          <w:tcPr>
+            <w:tcW w:type="dxa" w:w="4680"/>
+            <w:tcBorders>
+              <w:top w:val="single" w:sz="4" w:color="CCCCCC"/>
+              <w:bottom w:val="single" w:sz="4" w:color="CCCCCC"/>
+              <w:left w:val="single" w:sz="4" w:color="CCCCCC"/>
+              <w:right w:val="single" w:sz="4" w:color="CCCCCC"/>
+            </w:tcBorders>
+            <w:vAlign w:val="center"/>
+          </w:tcPr>
+          <w:p>
+            <w:r/>
+            <w:r>
+              <w:rPr>
+                <w:rFonts w:ascii="Arial" w:hAnsi="Arial"/>
+                <w:sz w:val="20"/>
+              </w:rPr>
+              <w:t>Antall planlagte brønner (PDO)</w:t>
+            </w:r>
+          </w:p>
+        </w:tc>
+        <w:tc>
+          <w:tcPr>
+            <w:tcW w:type="dxa" w:w="4680"/>
+            <w:tcBorders>
+              <w:top w:val="single" w:sz="4" w:color="CCCCCC"/>
+              <w:bottom w:val="single" w:sz="4" w:color="CCCCCC"/>
+              <w:left w:val="single" w:sz="4" w:color="CCCCCC"/>
+              <w:right w:val="single" w:sz="4" w:color="CCCCCC"/>
+            </w:tcBorders>
+            <w:vAlign w:val="center"/>
+          </w:tcPr>
+          <w:p>
+            <w:r/>
+            <w:r>
+              <w:rPr>
+                <w:rFonts w:ascii="Arial" w:hAnsi="Arial"/>
+                <w:sz w:val="20"/>
+              </w:rPr>
+              <w:t>Observert peak / decline / ramp</w:t>
+            </w:r>
+          </w:p>
+        </w:tc>
+      </w:tr>
+      <w:tr>
+        <w:tc>
+          <w:tcPr>
+            <w:tcW w:type="dxa" w:w="4680"/>
+            <w:tcBorders>
+              <w:top w:val="single" w:sz="4" w:color="CCCCCC"/>
+              <w:bottom w:val="single" w:sz="4" w:color="CCCCCC"/>
+              <w:left w:val="single" w:sz="4" w:color="CCCCCC"/>
+              <w:right w:val="single" w:sz="4" w:color="CCCCCC"/>
+            </w:tcBorders>
+            <w:vAlign w:val="center"/>
+          </w:tcPr>
+          <w:p>
+            <w:r/>
+            <w:r>
+              <w:rPr>
+                <w:rFonts w:ascii="Arial" w:hAnsi="Arial"/>
+                <w:sz w:val="20"/>
+              </w:rPr>
+              <w:t>Facility type (FPSO/Fixed/Subsea)</w:t>
+            </w:r>
+          </w:p>
+        </w:tc>
+        <w:tc>
+          <w:tcPr>
+            <w:tcW w:type="dxa" w:w="4680"/>
+            <w:tcBorders>
+              <w:top w:val="single" w:sz="4" w:color="CCCCCC"/>
+              <w:bottom w:val="single" w:sz="4" w:color="CCCCCC"/>
+              <w:left w:val="single" w:sz="4" w:color="CCCCCC"/>
+              <w:right w:val="single" w:sz="4" w:color="CCCCCC"/>
+            </w:tcBorders>
+            <w:vAlign w:val="center"/>
+          </w:tcPr>
+          <w:p>
+            <w:r/>
+            <w:r>
+              <w:rPr>
+                <w:rFonts w:ascii="Arial" w:hAnsi="Arial"/>
+                <w:sz w:val="20"/>
+              </w:rPr>
+              <w:t>Premium (krever 12 mnd data)</w:t>
+            </w:r>
+          </w:p>
+        </w:tc>
+      </w:tr>
+      <w:tr>
+        <w:tc>
+          <w:tcPr>
+            <w:tcW w:type="dxa" w:w="4680"/>
+            <w:tcBorders>
+              <w:top w:val="single" w:sz="4" w:color="CCCCCC"/>
+              <w:bottom w:val="single" w:sz="4" w:color="CCCCCC"/>
+              <w:left w:val="single" w:sz="4" w:color="CCCCCC"/>
+              <w:right w:val="single" w:sz="4" w:color="CCCCCC"/>
+            </w:tcBorders>
+            <w:vAlign w:val="center"/>
+          </w:tcPr>
+          <w:p>
+            <w:r/>
+            <w:r>
+              <w:rPr>
+                <w:rFonts w:ascii="Arial" w:hAnsi="Arial"/>
+                <w:sz w:val="20"/>
+              </w:rPr>
+              <w:t>API gravity (discovery DST)</w:t>
+            </w:r>
+          </w:p>
+        </w:tc>
+        <w:tc>
+          <w:tcPr>
+            <w:tcW w:type="dxa" w:w="4680"/>
+            <w:tcBorders>
+              <w:top w:val="single" w:sz="4" w:color="CCCCCC"/>
+              <w:bottom w:val="single" w:sz="4" w:color="CCCCCC"/>
+              <w:left w:val="single" w:sz="4" w:color="CCCCCC"/>
+              <w:right w:val="single" w:sz="4" w:color="CCCCCC"/>
+            </w:tcBorders>
+            <w:vAlign w:val="center"/>
+          </w:tcPr>
+          <w:p>
+            <w:r/>
+            <w:r>
+              <w:rPr>
+                <w:rFonts w:ascii="Arial" w:hAnsi="Arial"/>
+                <w:sz w:val="20"/>
+              </w:rPr>
+              <w:t>Realisert vannkutt</w:t>
+            </w:r>
+          </w:p>
+        </w:tc>
+      </w:tr>
+      <w:tr>
+        <w:tc>
+          <w:tcPr>
+            <w:tcW w:type="dxa" w:w="4680"/>
+            <w:tcBorders>
+              <w:top w:val="single" w:sz="4" w:color="CCCCCC"/>
+              <w:bottom w:val="single" w:sz="4" w:color="CCCCCC"/>
+              <w:left w:val="single" w:sz="4" w:color="CCCCCC"/>
+              <w:right w:val="single" w:sz="4" w:color="CCCCCC"/>
+            </w:tcBorders>
+            <w:vAlign w:val="center"/>
+          </w:tcPr>
+          <w:p>
+            <w:r/>
+            <w:r>
+              <w:rPr>
+                <w:rFonts w:ascii="Arial" w:hAnsi="Arial"/>
+                <w:sz w:val="20"/>
+              </w:rPr>
+              <w:t>Operatør (lisens-tildeling)</w:t>
+            </w:r>
+          </w:p>
+        </w:tc>
+        <w:tc>
+          <w:tcPr>
+            <w:tcW w:type="dxa" w:w="4680"/>
+            <w:tcBorders>
+              <w:top w:val="single" w:sz="4" w:color="CCCCCC"/>
+              <w:bottom w:val="single" w:sz="4" w:color="CCCCCC"/>
+              <w:left w:val="single" w:sz="4" w:color="CCCCCC"/>
+              <w:right w:val="single" w:sz="4" w:color="CCCCCC"/>
+            </w:tcBorders>
+            <w:vAlign w:val="center"/>
+          </w:tcPr>
+          <w:p>
+            <w:r/>
+            <w:r>
+              <w:rPr>
+                <w:rFonts w:ascii="Arial" w:hAnsi="Arial"/>
+                <w:sz w:val="20"/>
+              </w:rPr>
+              <w:t>Reservoaroverraskelser</w:t>
+            </w:r>
+          </w:p>
+        </w:tc>
+      </w:tr>
+    </w:tbl>
+    <w:p>
+      <w:pPr>
+        <w:spacing w:before="280" w:after="160"/>
+      </w:pPr>
+      <w:r>
+        <w:rPr>
+          <w:rFonts w:ascii="Arial" w:hAnsi="Arial"/>
+          <w:b/>
+          <w:color w:val="1F4E79"/>
+          <w:sz w:val="26"/>
+        </w:rPr>
+        <w:t>11.2 Peak-modell</w:t>
+      </w:r>
+    </w:p>
+    <w:p>
+      <w:pPr>
+        <w:spacing w:before="160" w:after="160"/>
+        <w:jc w:val="center"/>
+      </w:pPr>
+      <w:r>
+        <w:rPr>
+          <w:rFonts w:ascii="Courier New" w:hAnsi="Courier New"/>
+          <w:b/>
+          <w:color w:val="1F4E79"/>
+          <w:sz w:val="24"/>
+        </w:rPr>
+        <w:t>ln(peak_MSm³/mnd) = −3.05 + 0.49·ln(recoverable) + 0.18·ln(n_wells) + facility</w:t>
+      </w:r>
+    </w:p>
+    <w:p>
+      <w:pPr>
+        <w:spacing w:before="80" w:after="80"/>
+      </w:pPr>
+      <w:r>
+        <w:rPr>
+          <w:rFonts w:ascii="Arial" w:hAnsi="Arial"/>
+          <w:sz w:val="22"/>
+        </w:rPr>
+        <w:t>Trent på 63 NCS-felt med kjent utfall. En viktig oppdagelse: forenkling SLO den kompliserte modellen. Vi testet 13 variabler (API, vanndybde, decade, operatør-dummies) men de fleste var ikke signifikante og skapte overfitting. Den enkle modellen (recoverable + brønner + facility) ga bedre out-of-sample-ytelse.</w:t>
+      </w:r>
+    </w:p>
+    <w:p>
+      <w:pPr>
+        <w:spacing w:before="80" w:after="80"/>
+      </w:pPr>
+      <w:r>
+        <w:rPr>
+          <w:rFonts w:ascii="Arial" w:hAnsi="Arial"/>
+          <w:sz w:val="22"/>
+        </w:rPr>
+        <w:t>Recoverable er den dominerende variabelen (β=0.49, p&lt;0.001). Den konkave eksponenten (&lt;1) betyr at peak ikke skalerer lineært med reserves — større felt får lengre platå, ikke proporsjonalt høyere peak, fordi facility-kapasitet er et tak.</w:t>
+      </w:r>
+    </w:p>
+    <w:p>
+      <w:pPr>
+        <w:spacing w:before="80" w:after="80"/>
+      </w:pPr>
+      <w:r>
+        <w:rPr>
+          <w:rFonts w:ascii="Arial" w:hAnsi="Arial"/>
+          <w:b/>
+          <w:sz w:val="22"/>
+        </w:rPr>
+        <w:t>Duan smearing-korreksjon:</w:t>
+      </w:r>
+    </w:p>
+    <w:p>
+      <w:pPr>
+        <w:spacing w:before="80" w:after="80"/>
+      </w:pPr>
+      <w:r>
+        <w:rPr>
+          <w:rFonts w:ascii="Arial" w:hAnsi="Arial"/>
+          <w:sz w:val="22"/>
+        </w:rPr>
+        <w:t>Når en modell fittes i log-rom og transformeres tilbake med exp(), får man medianen, ikke gjennomsnittet — en systematisk underprediksjon (Jensen's ulikhet). Vi korrigerer med Duan's smearing-estimator (multipliserer med gjennomsnittet av exp(residualer) = 1.07). Dette reduserer bias fra −17% til −11%.</w:t>
+      </w:r>
+    </w:p>
+    <w:p>
+      <w:pPr>
+        <w:spacing w:before="280" w:after="160"/>
+      </w:pPr>
+      <w:r>
+        <w:rPr>
+          <w:rFonts w:ascii="Arial" w:hAnsi="Arial"/>
+          <w:b/>
+          <w:color w:val="1F4E79"/>
+          <w:sz w:val="26"/>
+        </w:rPr>
+        <w:t>11.3 Ramp, platå og decline sub-modeller</w:t>
+      </w:r>
+    </w:p>
+    <w:tbl>
+      <w:tblPr>
+        <w:tblW w:type="auto" w:w="0"/>
+        <w:jc w:val="center"/>
+        <w:tblLook w:firstColumn="1" w:firstRow="1" w:lastColumn="0" w:lastRow="0" w:noHBand="0" w:noVBand="1" w:val="04A0"/>
+      </w:tblPr>
+      <w:tblGrid>
+        <w:gridCol w:w="2340"/>
+        <w:gridCol w:w="2340"/>
+        <w:gridCol w:w="2340"/>
+        <w:gridCol w:w="2340"/>
+      </w:tblGrid>
+      <w:tr>
+        <w:tc>
+          <w:tcPr>
+            <w:tcW w:type="dxa" w:w="2304"/>
+            <w:shd w:fill="1F4E79" w:val="clear"/>
+            <w:tcBorders>
+              <w:top w:val="single" w:sz="4" w:color="CCCCCC"/>
+              <w:bottom w:val="single" w:sz="4" w:color="CCCCCC"/>
+              <w:left w:val="single" w:sz="4" w:color="CCCCCC"/>
+              <w:right w:val="single" w:sz="4" w:color="CCCCCC"/>
+            </w:tcBorders>
+            <w:vAlign w:val="center"/>
+          </w:tcPr>
+          <w:p>
+            <w:pPr>
+              <w:jc w:val="center"/>
+            </w:pPr>
+            <w:r/>
+            <w:r>
+              <w:rPr>
+                <w:rFonts w:ascii="Arial" w:hAnsi="Arial"/>
+                <w:b/>
+                <w:color w:val="FFFFFF"/>
+                <w:sz w:val="20"/>
+              </w:rPr>
+              <w:t>Sub-modell</w:t>
+            </w:r>
+          </w:p>
+        </w:tc>
+        <w:tc>
+          <w:tcPr>
+            <w:tcW w:type="dxa" w:w="3456"/>
+            <w:shd w:fill="1F4E79" w:val="clear"/>
+            <w:tcBorders>
+              <w:top w:val="single" w:sz="4" w:color="CCCCCC"/>
+              <w:bottom w:val="single" w:sz="4" w:color="CCCCCC"/>
+              <w:left w:val="single" w:sz="4" w:color="CCCCCC"/>
+              <w:right w:val="single" w:sz="4" w:color="CCCCCC"/>
+            </w:tcBorders>
+            <w:vAlign w:val="center"/>
+          </w:tcPr>
+          <w:p>
+            <w:pPr>
+              <w:jc w:val="center"/>
+            </w:pPr>
+            <w:r/>
+            <w:r>
+              <w:rPr>
+                <w:rFonts w:ascii="Arial" w:hAnsi="Arial"/>
+                <w:b/>
+                <w:color w:val="FFFFFF"/>
+                <w:sz w:val="20"/>
+              </w:rPr>
+              <w:t>Features</w:t>
+            </w:r>
+          </w:p>
+        </w:tc>
+        <w:tc>
+          <w:tcPr>
+            <w:tcW w:type="dxa" w:w="1872"/>
+            <w:shd w:fill="1F4E79" w:val="clear"/>
+            <w:tcBorders>
+              <w:top w:val="single" w:sz="4" w:color="CCCCCC"/>
+              <w:bottom w:val="single" w:sz="4" w:color="CCCCCC"/>
+              <w:left w:val="single" w:sz="4" w:color="CCCCCC"/>
+              <w:right w:val="single" w:sz="4" w:color="CCCCCC"/>
+            </w:tcBorders>
+            <w:vAlign w:val="center"/>
+          </w:tcPr>
+          <w:p>
+            <w:pPr>
+              <w:jc w:val="center"/>
+            </w:pPr>
+            <w:r/>
+            <w:r>
+              <w:rPr>
+                <w:rFonts w:ascii="Arial" w:hAnsi="Arial"/>
+                <w:b/>
+                <w:color w:val="FFFFFF"/>
+                <w:sz w:val="20"/>
+              </w:rPr>
+              <w:t>LOO CV R²</w:t>
+            </w:r>
+          </w:p>
+        </w:tc>
+        <w:tc>
+          <w:tcPr>
+            <w:tcW w:type="dxa" w:w="1872"/>
+            <w:shd w:fill="1F4E79" w:val="clear"/>
+            <w:tcBorders>
+              <w:top w:val="single" w:sz="4" w:color="CCCCCC"/>
+              <w:bottom w:val="single" w:sz="4" w:color="CCCCCC"/>
+              <w:left w:val="single" w:sz="4" w:color="CCCCCC"/>
+              <w:right w:val="single" w:sz="4" w:color="CCCCCC"/>
+            </w:tcBorders>
+            <w:vAlign w:val="center"/>
+          </w:tcPr>
+          <w:p>
+            <w:pPr>
+              <w:jc w:val="center"/>
+            </w:pPr>
+            <w:r/>
+            <w:r>
+              <w:rPr>
+                <w:rFonts w:ascii="Arial" w:hAnsi="Arial"/>
+                <w:b/>
+                <w:color w:val="FFFFFF"/>
+                <w:sz w:val="20"/>
+              </w:rPr>
+              <w:t>Out-of-sample</w:t>
+            </w:r>
+          </w:p>
+        </w:tc>
+      </w:tr>
+      <w:tr>
+        <w:tc>
+          <w:tcPr>
+            <w:tcW w:type="dxa" w:w="2340"/>
+            <w:tcBorders>
+              <w:top w:val="single" w:sz="4" w:color="CCCCCC"/>
+              <w:bottom w:val="single" w:sz="4" w:color="CCCCCC"/>
+              <w:left w:val="single" w:sz="4" w:color="CCCCCC"/>
+              <w:right w:val="single" w:sz="4" w:color="CCCCCC"/>
+            </w:tcBorders>
+            <w:vAlign w:val="center"/>
+          </w:tcPr>
+          <w:p>
+            <w:r/>
+            <w:r>
+              <w:rPr>
+                <w:rFonts w:ascii="Arial" w:hAnsi="Arial"/>
+                <w:sz w:val="20"/>
+              </w:rPr>
+              <w:t>Peak</w:t>
+            </w:r>
+          </w:p>
+        </w:tc>
+        <w:tc>
+          <w:tcPr>
+            <w:tcW w:type="dxa" w:w="2340"/>
+            <w:tcBorders>
+              <w:top w:val="single" w:sz="4" w:color="CCCCCC"/>
+              <w:bottom w:val="single" w:sz="4" w:color="CCCCCC"/>
+              <w:left w:val="single" w:sz="4" w:color="CCCCCC"/>
+              <w:right w:val="single" w:sz="4" w:color="CCCCCC"/>
+            </w:tcBorders>
+            <w:vAlign w:val="center"/>
+          </w:tcPr>
+          <w:p>
+            <w:pPr>
+              <w:jc w:val="center"/>
+            </w:pPr>
+            <w:r/>
+            <w:r>
+              <w:rPr>
+                <w:rFonts w:ascii="Arial" w:hAnsi="Arial"/>
+                <w:sz w:val="20"/>
+              </w:rPr>
+              <w:t>recov. + wells + facility</w:t>
+            </w:r>
+          </w:p>
+        </w:tc>
+        <w:tc>
+          <w:tcPr>
+            <w:tcW w:type="dxa" w:w="2340"/>
+            <w:tcBorders>
+              <w:top w:val="single" w:sz="4" w:color="CCCCCC"/>
+              <w:bottom w:val="single" w:sz="4" w:color="CCCCCC"/>
+              <w:left w:val="single" w:sz="4" w:color="CCCCCC"/>
+              <w:right w:val="single" w:sz="4" w:color="CCCCCC"/>
+            </w:tcBorders>
+            <w:vAlign w:val="center"/>
+          </w:tcPr>
+          <w:p>
+            <w:pPr>
+              <w:jc w:val="center"/>
+            </w:pPr>
+            <w:r/>
+            <w:r>
+              <w:rPr>
+                <w:rFonts w:ascii="Arial" w:hAnsi="Arial"/>
+                <w:color w:val="2E7D32"/>
+                <w:sz w:val="20"/>
+              </w:rPr>
+              <w:t>0.84 (log)</w:t>
+            </w:r>
+          </w:p>
+        </w:tc>
+        <w:tc>
+          <w:tcPr>
+            <w:tcW w:type="dxa" w:w="2340"/>
+            <w:tcBorders>
+              <w:top w:val="single" w:sz="4" w:color="CCCCCC"/>
+              <w:bottom w:val="single" w:sz="4" w:color="CCCCCC"/>
+              <w:left w:val="single" w:sz="4" w:color="CCCCCC"/>
+              <w:right w:val="single" w:sz="4" w:color="CCCCCC"/>
+            </w:tcBorders>
+            <w:vAlign w:val="center"/>
+          </w:tcPr>
+          <w:p>
+            <w:pPr>
+              <w:jc w:val="center"/>
+            </w:pPr>
+            <w:r/>
+            <w:r>
+              <w:rPr>
+                <w:rFonts w:ascii="Arial" w:hAnsi="Arial"/>
+                <w:color w:val="E65100"/>
+                <w:sz w:val="20"/>
+              </w:rPr>
+              <w:t>±35%</w:t>
+            </w:r>
+          </w:p>
+        </w:tc>
+      </w:tr>
+      <w:tr>
+        <w:tc>
+          <w:tcPr>
+            <w:tcW w:type="dxa" w:w="2340"/>
+            <w:tcBorders>
+              <w:top w:val="single" w:sz="4" w:color="CCCCCC"/>
+              <w:bottom w:val="single" w:sz="4" w:color="CCCCCC"/>
+              <w:left w:val="single" w:sz="4" w:color="CCCCCC"/>
+              <w:right w:val="single" w:sz="4" w:color="CCCCCC"/>
+            </w:tcBorders>
+            <w:vAlign w:val="center"/>
+          </w:tcPr>
+          <w:p>
+            <w:r/>
+            <w:r>
+              <w:rPr>
+                <w:rFonts w:ascii="Arial" w:hAnsi="Arial"/>
+                <w:sz w:val="20"/>
+              </w:rPr>
+              <w:t>Ramp</w:t>
+            </w:r>
+          </w:p>
+        </w:tc>
+        <w:tc>
+          <w:tcPr>
+            <w:tcW w:type="dxa" w:w="2340"/>
+            <w:tcBorders>
+              <w:top w:val="single" w:sz="4" w:color="CCCCCC"/>
+              <w:bottom w:val="single" w:sz="4" w:color="CCCCCC"/>
+              <w:left w:val="single" w:sz="4" w:color="CCCCCC"/>
+              <w:right w:val="single" w:sz="4" w:color="CCCCCC"/>
+            </w:tcBorders>
+            <w:vAlign w:val="center"/>
+          </w:tcPr>
+          <w:p>
+            <w:pPr>
+              <w:jc w:val="center"/>
+            </w:pPr>
+            <w:r/>
+            <w:r>
+              <w:rPr>
+                <w:rFonts w:ascii="Arial" w:hAnsi="Arial"/>
+                <w:sz w:val="20"/>
+              </w:rPr>
+              <w:t>recoverable</w:t>
+            </w:r>
+          </w:p>
+        </w:tc>
+        <w:tc>
+          <w:tcPr>
+            <w:tcW w:type="dxa" w:w="2340"/>
+            <w:tcBorders>
+              <w:top w:val="single" w:sz="4" w:color="CCCCCC"/>
+              <w:bottom w:val="single" w:sz="4" w:color="CCCCCC"/>
+              <w:left w:val="single" w:sz="4" w:color="CCCCCC"/>
+              <w:right w:val="single" w:sz="4" w:color="CCCCCC"/>
+            </w:tcBorders>
+            <w:vAlign w:val="center"/>
+          </w:tcPr>
+          <w:p>
+            <w:pPr>
+              <w:jc w:val="center"/>
+            </w:pPr>
+            <w:r/>
+            <w:r>
+              <w:rPr>
+                <w:rFonts w:ascii="Arial" w:hAnsi="Arial"/>
+                <w:sz w:val="20"/>
+              </w:rPr>
+              <w:t>0.29</w:t>
+            </w:r>
+          </w:p>
+        </w:tc>
+        <w:tc>
+          <w:tcPr>
+            <w:tcW w:type="dxa" w:w="2340"/>
+            <w:tcBorders>
+              <w:top w:val="single" w:sz="4" w:color="CCCCCC"/>
+              <w:bottom w:val="single" w:sz="4" w:color="CCCCCC"/>
+              <w:left w:val="single" w:sz="4" w:color="CCCCCC"/>
+              <w:right w:val="single" w:sz="4" w:color="CCCCCC"/>
+            </w:tcBorders>
+            <w:vAlign w:val="center"/>
+          </w:tcPr>
+          <w:p>
+            <w:pPr>
+              <w:jc w:val="center"/>
+            </w:pPr>
+            <w:r/>
+            <w:r>
+              <w:rPr>
+                <w:rFonts w:ascii="Arial" w:hAnsi="Arial"/>
+                <w:color w:val="2E7D32"/>
+                <w:sz w:val="20"/>
+              </w:rPr>
+              <w:t>±5 mnd</w:t>
+            </w:r>
+          </w:p>
+        </w:tc>
+      </w:tr>
+      <w:tr>
+        <w:tc>
+          <w:tcPr>
+            <w:tcW w:type="dxa" w:w="2340"/>
+            <w:tcBorders>
+              <w:top w:val="single" w:sz="4" w:color="CCCCCC"/>
+              <w:bottom w:val="single" w:sz="4" w:color="CCCCCC"/>
+              <w:left w:val="single" w:sz="4" w:color="CCCCCC"/>
+              <w:right w:val="single" w:sz="4" w:color="CCCCCC"/>
+            </w:tcBorders>
+            <w:vAlign w:val="center"/>
+          </w:tcPr>
+          <w:p>
+            <w:r/>
+            <w:r>
+              <w:rPr>
+                <w:rFonts w:ascii="Arial" w:hAnsi="Arial"/>
+                <w:sz w:val="20"/>
+              </w:rPr>
+              <w:t>Plateau</w:t>
+            </w:r>
+          </w:p>
+        </w:tc>
+        <w:tc>
+          <w:tcPr>
+            <w:tcW w:type="dxa" w:w="2340"/>
+            <w:tcBorders>
+              <w:top w:val="single" w:sz="4" w:color="CCCCCC"/>
+              <w:bottom w:val="single" w:sz="4" w:color="CCCCCC"/>
+              <w:left w:val="single" w:sz="4" w:color="CCCCCC"/>
+              <w:right w:val="single" w:sz="4" w:color="CCCCCC"/>
+            </w:tcBorders>
+            <w:vAlign w:val="center"/>
+          </w:tcPr>
+          <w:p>
+            <w:pPr>
+              <w:jc w:val="center"/>
+            </w:pPr>
+            <w:r/>
+            <w:r>
+              <w:rPr>
+                <w:rFonts w:ascii="Arial" w:hAnsi="Arial"/>
+                <w:sz w:val="20"/>
+              </w:rPr>
+              <w:t>recoverable</w:t>
+            </w:r>
+          </w:p>
+        </w:tc>
+        <w:tc>
+          <w:tcPr>
+            <w:tcW w:type="dxa" w:w="2340"/>
+            <w:tcBorders>
+              <w:top w:val="single" w:sz="4" w:color="CCCCCC"/>
+              <w:bottom w:val="single" w:sz="4" w:color="CCCCCC"/>
+              <w:left w:val="single" w:sz="4" w:color="CCCCCC"/>
+              <w:right w:val="single" w:sz="4" w:color="CCCCCC"/>
+            </w:tcBorders>
+            <w:vAlign w:val="center"/>
+          </w:tcPr>
+          <w:p>
+            <w:pPr>
+              <w:jc w:val="center"/>
+            </w:pPr>
+            <w:r/>
+            <w:r>
+              <w:rPr>
+                <w:rFonts w:ascii="Arial" w:hAnsi="Arial"/>
+                <w:sz w:val="20"/>
+              </w:rPr>
+              <w:t>0.28</w:t>
+            </w:r>
+          </w:p>
+        </w:tc>
+        <w:tc>
+          <w:tcPr>
+            <w:tcW w:type="dxa" w:w="2340"/>
+            <w:tcBorders>
+              <w:top w:val="single" w:sz="4" w:color="CCCCCC"/>
+              <w:bottom w:val="single" w:sz="4" w:color="CCCCCC"/>
+              <w:left w:val="single" w:sz="4" w:color="CCCCCC"/>
+              <w:right w:val="single" w:sz="4" w:color="CCCCCC"/>
+            </w:tcBorders>
+            <w:vAlign w:val="center"/>
+          </w:tcPr>
+          <w:p>
+            <w:pPr>
+              <w:jc w:val="center"/>
+            </w:pPr>
+            <w:r/>
+            <w:r>
+              <w:rPr>
+                <w:rFonts w:ascii="Arial" w:hAnsi="Arial"/>
+                <w:color w:val="2E7D32"/>
+                <w:sz w:val="20"/>
+              </w:rPr>
+              <w:t>±4 mnd</w:t>
+            </w:r>
+          </w:p>
+        </w:tc>
+      </w:tr>
+      <w:tr>
+        <w:tc>
+          <w:tcPr>
+            <w:tcW w:type="dxa" w:w="2340"/>
+            <w:tcBorders>
+              <w:top w:val="single" w:sz="4" w:color="CCCCCC"/>
+              <w:bottom w:val="single" w:sz="4" w:color="CCCCCC"/>
+              <w:left w:val="single" w:sz="4" w:color="CCCCCC"/>
+              <w:right w:val="single" w:sz="4" w:color="CCCCCC"/>
+            </w:tcBorders>
+            <w:vAlign w:val="center"/>
+          </w:tcPr>
+          <w:p>
+            <w:r/>
+            <w:r>
+              <w:rPr>
+                <w:rFonts w:ascii="Arial" w:hAnsi="Arial"/>
+                <w:sz w:val="20"/>
+              </w:rPr>
+              <w:t>Decline</w:t>
+            </w:r>
+          </w:p>
+        </w:tc>
+        <w:tc>
+          <w:tcPr>
+            <w:tcW w:type="dxa" w:w="2340"/>
+            <w:tcBorders>
+              <w:top w:val="single" w:sz="4" w:color="CCCCCC"/>
+              <w:bottom w:val="single" w:sz="4" w:color="CCCCCC"/>
+              <w:left w:val="single" w:sz="4" w:color="CCCCCC"/>
+              <w:right w:val="single" w:sz="4" w:color="CCCCCC"/>
+            </w:tcBorders>
+            <w:vAlign w:val="center"/>
+          </w:tcPr>
+          <w:p>
+            <w:pPr>
+              <w:jc w:val="center"/>
+            </w:pPr>
+            <w:r/>
+            <w:r>
+              <w:rPr>
+                <w:rFonts w:ascii="Arial" w:hAnsi="Arial"/>
+                <w:sz w:val="20"/>
+              </w:rPr>
+              <w:t>recov. + wells + operatør</w:t>
+            </w:r>
+          </w:p>
+        </w:tc>
+        <w:tc>
+          <w:tcPr>
+            <w:tcW w:type="dxa" w:w="2340"/>
+            <w:tcBorders>
+              <w:top w:val="single" w:sz="4" w:color="CCCCCC"/>
+              <w:bottom w:val="single" w:sz="4" w:color="CCCCCC"/>
+              <w:left w:val="single" w:sz="4" w:color="CCCCCC"/>
+              <w:right w:val="single" w:sz="4" w:color="CCCCCC"/>
+            </w:tcBorders>
+            <w:vAlign w:val="center"/>
+          </w:tcPr>
+          <w:p>
+            <w:pPr>
+              <w:jc w:val="center"/>
+            </w:pPr>
+            <w:r/>
+            <w:r>
+              <w:rPr>
+                <w:rFonts w:ascii="Arial" w:hAnsi="Arial"/>
+                <w:sz w:val="20"/>
+              </w:rPr>
+              <w:t>0.35</w:t>
+            </w:r>
+          </w:p>
+        </w:tc>
+        <w:tc>
+          <w:tcPr>
+            <w:tcW w:type="dxa" w:w="2340"/>
+            <w:tcBorders>
+              <w:top w:val="single" w:sz="4" w:color="CCCCCC"/>
+              <w:bottom w:val="single" w:sz="4" w:color="CCCCCC"/>
+              <w:left w:val="single" w:sz="4" w:color="CCCCCC"/>
+              <w:right w:val="single" w:sz="4" w:color="CCCCCC"/>
+            </w:tcBorders>
+            <w:vAlign w:val="center"/>
+          </w:tcPr>
+          <w:p>
+            <w:pPr>
+              <w:jc w:val="center"/>
+            </w:pPr>
+            <w:r/>
+            <w:r>
+              <w:rPr>
+                <w:rFonts w:ascii="Arial" w:hAnsi="Arial"/>
+                <w:sz w:val="20"/>
+              </w:rPr>
+              <w:t>kalibrert</w:t>
+            </w:r>
+          </w:p>
+        </w:tc>
+      </w:tr>
+    </w:tbl>
+    <w:p>
+      <w:pPr>
+        <w:spacing w:after="200"/>
+        <w:jc w:val="center"/>
+      </w:pPr>
+      <w:r>
+        <w:rPr>
+          <w:rFonts w:ascii="Arial" w:hAnsi="Arial"/>
+          <w:i/>
+          <w:color w:val="595959"/>
+          <w:sz w:val="18"/>
+        </w:rPr>
+        <w:t>Tabell: Sub-modeller. Forenkling forbedret ramp (0.10→0.29) og platå (0.19→0.28) ved å fjerne overfitting-variabler.</w:t>
+      </w:r>
+    </w:p>
+    <w:p>
+      <w:pPr>
+        <w:spacing w:before="280" w:after="160"/>
+      </w:pPr>
+      <w:r>
+        <w:rPr>
+          <w:rFonts w:ascii="Arial" w:hAnsi="Arial"/>
+          <w:b/>
+          <w:color w:val="1F4E79"/>
+          <w:sz w:val="26"/>
+        </w:rPr>
+        <w:t>11.4 Lifecycle-integrasjon med joint bootstrap</w:t>
+      </w:r>
+    </w:p>
+    <w:p>
+      <w:pPr>
+        <w:spacing w:before="80" w:after="80"/>
+      </w:pPr>
+      <w:r>
+        <w:rPr>
+          <w:rFonts w:ascii="Arial" w:hAnsi="Arial"/>
+          <w:sz w:val="22"/>
+        </w:rPr>
+        <w:t>De fire sub-modellene kombineres til én produksjonskurve (logistisk ramp + konstant platå + eksponentiell decline). To kritiske design-valg gjør usikkerheten realistisk:</w:t>
+      </w:r>
+    </w:p>
+    <w:p>
+      <w:pPr>
+        <w:pStyle w:val="ListBullet"/>
+        <w:spacing w:before="40" w:after="40"/>
+      </w:pPr>
+      <w:r>
+        <w:rPr>
+          <w:rFonts w:ascii="Arial" w:hAnsi="Arial"/>
+          <w:sz w:val="22"/>
+        </w:rPr>
+        <w:t>Joint bootstrap: samme felt-resampling brukes på tvers av alle fire modeller, slik at parameter-korrelasjoner bevares (store felt får både høy peak OG langt platå — ikke umulige kombinasjoner)</w:t>
+      </w:r>
+    </w:p>
+    <w:p>
+      <w:pPr>
+        <w:pStyle w:val="ListBullet"/>
+        <w:spacing w:before="40" w:after="40"/>
+      </w:pPr>
+      <w:r>
+        <w:rPr>
+          <w:rFonts w:ascii="Arial" w:hAnsi="Arial"/>
+          <w:sz w:val="22"/>
+        </w:rPr>
+        <w:t>Recovery-constraint: decline løses analytisk slik at kumulativ produksjon = recoverable reserves. Dette sikrer fysisk konsistens (recovery-ratio 1.00-1.01)</w:t>
+      </w:r>
+    </w:p>
+    <w:p>
+      <w:pPr>
+        <w:spacing w:before="80" w:after="80"/>
+      </w:pPr>
+      <w:r>
+        <w:rPr>
+          <w:rFonts w:ascii="Arial" w:hAnsi="Arial"/>
+          <w:sz w:val="22"/>
+        </w:rPr>
+        <w:t>Resultatet er P10/P50/P90-bånd som er fysisk plausible — ramp 21-29 mnd i stedet for det meningsløse 1-1626 mnd-båndet en naiv uavhengig sampling gir.</w:t>
+      </w:r>
+    </w:p>
+    <w:p>
+      <w:pPr>
+        <w:spacing w:before="360" w:after="200"/>
+      </w:pPr>
+      <w:r>
+        <w:rPr>
+          <w:rFonts w:ascii="Arial" w:hAnsi="Arial"/>
+          <w:b/>
+          <w:color w:val="1F4E79"/>
+          <w:sz w:val="32"/>
+        </w:rPr>
+        <w:t>12. Out-of-sample hold-out validering</w:t>
+      </w:r>
+    </w:p>
+    <w:p>
+      <w:pPr>
+        <w:spacing w:before="80" w:after="80"/>
+      </w:pPr>
+      <w:r>
+        <w:rPr>
+          <w:rFonts w:ascii="Arial" w:hAnsi="Arial"/>
+          <w:sz w:val="22"/>
+        </w:rPr>
+        <w:t>Den viktigste ærlighetstesten: lat som et nylig felt er ukjent, re-tren modellen UTEN det, og forecast blindt fra kun PDO-input. Vi testet 13 felt som kom online nylig (Johan Sverdrup 2019, Edvard Grieg 2015, Goliat 2016, m.fl.).</w:t>
+      </w:r>
+    </w:p>
+    <w:p>
+      <w:pPr>
+        <w:spacing w:before="200" w:after="100"/>
+        <w:jc w:val="center"/>
+      </w:pPr>
+      <w:r>
+        <w:drawing>
+          <wp:inline xmlns:a="http://schemas.openxmlformats.org/drawingml/2006/main" xmlns:pic="http://schemas.openxmlformats.org/drawingml/2006/picture">
+            <wp:extent cx="5943600" cy="1878020"/>
+            <wp:docPr id="6" name="Picture 6"/>
+            <wp:cNvGraphicFramePr>
+              <a:graphicFrameLocks noChangeAspect="1"/>
+            </wp:cNvGraphicFramePr>
+            <a:graphic>
+              <a:graphicData uri="http://schemas.openxmlformats.org/drawingml/2006/picture">
+                <pic:pic>
+                  <pic:nvPicPr>
+                    <pic:cNvPr id="0" name="fig_holdout_validation.png"/>
+                    <pic:cNvPicPr/>
+                  </pic:nvPicPr>
+                  <pic:blipFill>
+                    <a:blip r:embed="rId14"/>
+                    <a:stretch>
+                      <a:fillRect/>
+                    </a:stretch>
+                  </pic:blipFill>
+                  <pic:spPr>
+                    <a:xfrm>
+                      <a:off x="0" y="0"/>
+                      <a:ext cx="5943600" cy="1878020"/>
+                    </a:xfrm>
+                    <a:prstGeom prst="rect"/>
+                  </pic:spPr>
+                </pic:pic>
+              </a:graphicData>
+            </a:graphic>
+          </wp:inline>
+        </w:drawing>
+      </w:r>
+    </w:p>
+    <w:p>
+      <w:pPr>
+        <w:spacing w:after="200"/>
+        <w:jc w:val="center"/>
+      </w:pPr>
+      <w:r>
+        <w:rPr>
+          <w:rFonts w:ascii="Arial" w:hAnsi="Arial"/>
+          <w:i/>
+          <w:color w:val="595959"/>
+          <w:sz w:val="18"/>
+        </w:rPr>
+        <w:t>Figur 6: Hold-out validering. Modellen så ALDRI testfeltet under trening. Ramp/platå treffer presist (±5/±4 mnd); peak-nivå har ~35% median feil — et range-verktøy, ikke punkt-estimat.</w:t>
+      </w:r>
+    </w:p>
+    <w:p>
+      <w:pPr>
+        <w:spacing w:before="280" w:after="160"/>
+      </w:pPr>
+      <w:r>
+        <w:rPr>
+          <w:rFonts w:ascii="Arial" w:hAnsi="Arial"/>
+          <w:b/>
+          <w:color w:val="1F4E79"/>
+          <w:sz w:val="26"/>
+        </w:rPr>
+        <w:t>12.1 Det ærlige resultatet</w:t>
+      </w:r>
+    </w:p>
+    <w:tbl>
+      <w:tblPr>
+        <w:tblW w:type="auto" w:w="0"/>
+        <w:jc w:val="center"/>
+        <w:tblLook w:firstColumn="1" w:firstRow="1" w:lastColumn="0" w:lastRow="0" w:noHBand="0" w:noVBand="1" w:val="04A0"/>
+      </w:tblPr>
+      <w:tblGrid>
+        <w:gridCol w:w="3120"/>
+        <w:gridCol w:w="3120"/>
+        <w:gridCol w:w="3120"/>
+      </w:tblGrid>
+      <w:tr>
+        <w:tc>
+          <w:tcPr>
+            <w:tcW w:type="dxa" w:w="2880"/>
+            <w:shd w:fill="1F4E79" w:val="clear"/>
+            <w:tcBorders>
+              <w:top w:val="single" w:sz="4" w:color="CCCCCC"/>
+              <w:bottom w:val="single" w:sz="4" w:color="CCCCCC"/>
+              <w:left w:val="single" w:sz="4" w:color="CCCCCC"/>
+              <w:right w:val="single" w:sz="4" w:color="CCCCCC"/>
+            </w:tcBorders>
+            <w:vAlign w:val="center"/>
+          </w:tcPr>
+          <w:p>
+            <w:pPr>
+              <w:jc w:val="center"/>
+            </w:pPr>
+            <w:r/>
+            <w:r>
+              <w:rPr>
+                <w:rFonts w:ascii="Arial" w:hAnsi="Arial"/>
+                <w:b/>
+                <w:color w:val="FFFFFF"/>
+                <w:sz w:val="20"/>
+              </w:rPr>
+              <w:t>Komponent</w:t>
+            </w:r>
+          </w:p>
+        </w:tc>
+        <w:tc>
+          <w:tcPr>
+            <w:tcW w:type="dxa" w:w="4032"/>
+            <w:shd w:fill="1F4E79" w:val="clear"/>
+            <w:tcBorders>
+              <w:top w:val="single" w:sz="4" w:color="CCCCCC"/>
+              <w:bottom w:val="single" w:sz="4" w:color="CCCCCC"/>
+              <w:left w:val="single" w:sz="4" w:color="CCCCCC"/>
+              <w:right w:val="single" w:sz="4" w:color="CCCCCC"/>
+            </w:tcBorders>
+            <w:vAlign w:val="center"/>
+          </w:tcPr>
+          <w:p>
+            <w:pPr>
+              <w:jc w:val="center"/>
+            </w:pPr>
+            <w:r/>
+            <w:r>
+              <w:rPr>
+                <w:rFonts w:ascii="Arial" w:hAnsi="Arial"/>
+                <w:b/>
+                <w:color w:val="FFFFFF"/>
+                <w:sz w:val="20"/>
+              </w:rPr>
+              <w:t>Out-of-sample resultat</w:t>
+            </w:r>
+          </w:p>
+        </w:tc>
+        <w:tc>
+          <w:tcPr>
+            <w:tcW w:type="dxa" w:w="2592"/>
+            <w:shd w:fill="1F4E79" w:val="clear"/>
+            <w:tcBorders>
+              <w:top w:val="single" w:sz="4" w:color="CCCCCC"/>
+              <w:bottom w:val="single" w:sz="4" w:color="CCCCCC"/>
+              <w:left w:val="single" w:sz="4" w:color="CCCCCC"/>
+              <w:right w:val="single" w:sz="4" w:color="CCCCCC"/>
+            </w:tcBorders>
+            <w:vAlign w:val="center"/>
+          </w:tcPr>
+          <w:p>
+            <w:pPr>
+              <w:jc w:val="center"/>
+            </w:pPr>
+            <w:r/>
+            <w:r>
+              <w:rPr>
+                <w:rFonts w:ascii="Arial" w:hAnsi="Arial"/>
+                <w:b/>
+                <w:color w:val="FFFFFF"/>
+                <w:sz w:val="20"/>
+              </w:rPr>
+              <w:t>Dom</w:t>
+            </w:r>
+          </w:p>
+        </w:tc>
+      </w:tr>
+      <w:tr>
+        <w:tc>
+          <w:tcPr>
+            <w:tcW w:type="dxa" w:w="3120"/>
+            <w:tcBorders>
+              <w:top w:val="single" w:sz="4" w:color="CCCCCC"/>
+              <w:bottom w:val="single" w:sz="4" w:color="CCCCCC"/>
+              <w:left w:val="single" w:sz="4" w:color="CCCCCC"/>
+              <w:right w:val="single" w:sz="4" w:color="CCCCCC"/>
+            </w:tcBorders>
+            <w:vAlign w:val="center"/>
+          </w:tcPr>
+          <w:p>
+            <w:r/>
+            <w:r>
+              <w:rPr>
+                <w:rFonts w:ascii="Arial" w:hAnsi="Arial"/>
+                <w:sz w:val="20"/>
+              </w:rPr>
+              <w:t>Ramp</w:t>
+            </w:r>
+          </w:p>
+        </w:tc>
+        <w:tc>
+          <w:tcPr>
+            <w:tcW w:type="dxa" w:w="3120"/>
+            <w:tcBorders>
+              <w:top w:val="single" w:sz="4" w:color="CCCCCC"/>
+              <w:bottom w:val="single" w:sz="4" w:color="CCCCCC"/>
+              <w:left w:val="single" w:sz="4" w:color="CCCCCC"/>
+              <w:right w:val="single" w:sz="4" w:color="CCCCCC"/>
+            </w:tcBorders>
+            <w:vAlign w:val="center"/>
+          </w:tcPr>
+          <w:p>
+            <w:r/>
+            <w:r>
+              <w:rPr>
+                <w:rFonts w:ascii="Arial" w:hAnsi="Arial"/>
+                <w:sz w:val="20"/>
+              </w:rPr>
+              <w:t>median feil ±5 mnd</w:t>
+            </w:r>
+          </w:p>
+        </w:tc>
+        <w:tc>
+          <w:tcPr>
+            <w:tcW w:type="dxa" w:w="3120"/>
+            <w:tcBorders>
+              <w:top w:val="single" w:sz="4" w:color="CCCCCC"/>
+              <w:bottom w:val="single" w:sz="4" w:color="CCCCCC"/>
+              <w:left w:val="single" w:sz="4" w:color="CCCCCC"/>
+              <w:right w:val="single" w:sz="4" w:color="CCCCCC"/>
+            </w:tcBorders>
+            <w:vAlign w:val="center"/>
+          </w:tcPr>
+          <w:p>
+            <w:r/>
+            <w:r>
+              <w:rPr>
+                <w:rFonts w:ascii="Arial" w:hAnsi="Arial"/>
+                <w:color w:val="2E7D32"/>
+                <w:sz w:val="20"/>
+              </w:rPr>
+              <w:t>Punkt-estimat</w:t>
+            </w:r>
+          </w:p>
+        </w:tc>
+      </w:tr>
+      <w:tr>
+        <w:tc>
+          <w:tcPr>
+            <w:tcW w:type="dxa" w:w="3120"/>
+            <w:tcBorders>
+              <w:top w:val="single" w:sz="4" w:color="CCCCCC"/>
+              <w:bottom w:val="single" w:sz="4" w:color="CCCCCC"/>
+              <w:left w:val="single" w:sz="4" w:color="CCCCCC"/>
+              <w:right w:val="single" w:sz="4" w:color="CCCCCC"/>
+            </w:tcBorders>
+            <w:vAlign w:val="center"/>
+          </w:tcPr>
+          <w:p>
+            <w:r/>
+            <w:r>
+              <w:rPr>
+                <w:rFonts w:ascii="Arial" w:hAnsi="Arial"/>
+                <w:sz w:val="20"/>
+              </w:rPr>
+              <w:t>Plateau</w:t>
+            </w:r>
+          </w:p>
+        </w:tc>
+        <w:tc>
+          <w:tcPr>
+            <w:tcW w:type="dxa" w:w="3120"/>
+            <w:tcBorders>
+              <w:top w:val="single" w:sz="4" w:color="CCCCCC"/>
+              <w:bottom w:val="single" w:sz="4" w:color="CCCCCC"/>
+              <w:left w:val="single" w:sz="4" w:color="CCCCCC"/>
+              <w:right w:val="single" w:sz="4" w:color="CCCCCC"/>
+            </w:tcBorders>
+            <w:vAlign w:val="center"/>
+          </w:tcPr>
+          <w:p>
+            <w:r/>
+            <w:r>
+              <w:rPr>
+                <w:rFonts w:ascii="Arial" w:hAnsi="Arial"/>
+                <w:sz w:val="20"/>
+              </w:rPr>
+              <w:t>median feil ±4 mnd</w:t>
+            </w:r>
+          </w:p>
+        </w:tc>
+        <w:tc>
+          <w:tcPr>
+            <w:tcW w:type="dxa" w:w="3120"/>
+            <w:tcBorders>
+              <w:top w:val="single" w:sz="4" w:color="CCCCCC"/>
+              <w:bottom w:val="single" w:sz="4" w:color="CCCCCC"/>
+              <w:left w:val="single" w:sz="4" w:color="CCCCCC"/>
+              <w:right w:val="single" w:sz="4" w:color="CCCCCC"/>
+            </w:tcBorders>
+            <w:vAlign w:val="center"/>
+          </w:tcPr>
+          <w:p>
+            <w:r/>
+            <w:r>
+              <w:rPr>
+                <w:rFonts w:ascii="Arial" w:hAnsi="Arial"/>
+                <w:color w:val="2E7D32"/>
+                <w:sz w:val="20"/>
+              </w:rPr>
+              <w:t>Punkt-estimat</w:t>
+            </w:r>
+          </w:p>
+        </w:tc>
+      </w:tr>
+      <w:tr>
+        <w:tc>
+          <w:tcPr>
+            <w:tcW w:type="dxa" w:w="3120"/>
+            <w:tcBorders>
+              <w:top w:val="single" w:sz="4" w:color="CCCCCC"/>
+              <w:bottom w:val="single" w:sz="4" w:color="CCCCCC"/>
+              <w:left w:val="single" w:sz="4" w:color="CCCCCC"/>
+              <w:right w:val="single" w:sz="4" w:color="CCCCCC"/>
+            </w:tcBorders>
+            <w:vAlign w:val="center"/>
+          </w:tcPr>
+          <w:p>
+            <w:r/>
+            <w:r>
+              <w:rPr>
+                <w:rFonts w:ascii="Arial" w:hAnsi="Arial"/>
+                <w:sz w:val="20"/>
+              </w:rPr>
+              <w:t>Peak (nivå)</w:t>
+            </w:r>
+          </w:p>
+        </w:tc>
+        <w:tc>
+          <w:tcPr>
+            <w:tcW w:type="dxa" w:w="3120"/>
+            <w:tcBorders>
+              <w:top w:val="single" w:sz="4" w:color="CCCCCC"/>
+              <w:bottom w:val="single" w:sz="4" w:color="CCCCCC"/>
+              <w:left w:val="single" w:sz="4" w:color="CCCCCC"/>
+              <w:right w:val="single" w:sz="4" w:color="CCCCCC"/>
+            </w:tcBorders>
+            <w:vAlign w:val="center"/>
+          </w:tcPr>
+          <w:p>
+            <w:r/>
+            <w:r>
+              <w:rPr>
+                <w:rFonts w:ascii="Arial" w:hAnsi="Arial"/>
+                <w:sz w:val="20"/>
+              </w:rPr>
+              <w:t>median feil ~35%</w:t>
+            </w:r>
+          </w:p>
+        </w:tc>
+        <w:tc>
+          <w:tcPr>
+            <w:tcW w:type="dxa" w:w="3120"/>
+            <w:tcBorders>
+              <w:top w:val="single" w:sz="4" w:color="CCCCCC"/>
+              <w:bottom w:val="single" w:sz="4" w:color="CCCCCC"/>
+              <w:left w:val="single" w:sz="4" w:color="CCCCCC"/>
+              <w:right w:val="single" w:sz="4" w:color="CCCCCC"/>
+            </w:tcBorders>
+            <w:vAlign w:val="center"/>
+          </w:tcPr>
+          <w:p>
+            <w:r/>
+            <w:r>
+              <w:rPr>
+                <w:rFonts w:ascii="Arial" w:hAnsi="Arial"/>
+                <w:color w:val="E65100"/>
+                <w:sz w:val="20"/>
+              </w:rPr>
+              <w:t>Range-verktøy</w:t>
+            </w:r>
+          </w:p>
+        </w:tc>
+      </w:tr>
+      <w:tr>
+        <w:tc>
+          <w:tcPr>
+            <w:tcW w:type="dxa" w:w="3120"/>
+            <w:tcBorders>
+              <w:top w:val="single" w:sz="4" w:color="CCCCCC"/>
+              <w:bottom w:val="single" w:sz="4" w:color="CCCCCC"/>
+              <w:left w:val="single" w:sz="4" w:color="CCCCCC"/>
+              <w:right w:val="single" w:sz="4" w:color="CCCCCC"/>
+            </w:tcBorders>
+            <w:vAlign w:val="center"/>
+          </w:tcPr>
+          <w:p>
+            <w:r/>
+            <w:r>
+              <w:rPr>
+                <w:rFonts w:ascii="Arial" w:hAnsi="Arial"/>
+                <w:sz w:val="20"/>
+              </w:rPr>
+              <w:t>Decline (V5.1)</w:t>
+            </w:r>
+          </w:p>
+        </w:tc>
+        <w:tc>
+          <w:tcPr>
+            <w:tcW w:type="dxa" w:w="3120"/>
+            <w:tcBorders>
+              <w:top w:val="single" w:sz="4" w:color="CCCCCC"/>
+              <w:bottom w:val="single" w:sz="4" w:color="CCCCCC"/>
+              <w:left w:val="single" w:sz="4" w:color="CCCCCC"/>
+              <w:right w:val="single" w:sz="4" w:color="CCCCCC"/>
+            </w:tcBorders>
+            <w:vAlign w:val="center"/>
+          </w:tcPr>
+          <w:p>
+            <w:r/>
+            <w:r>
+              <w:rPr>
+                <w:rFonts w:ascii="Arial" w:hAnsi="Arial"/>
+                <w:sz w:val="20"/>
+              </w:rPr>
+              <w:t>nested CV R²=0.66</w:t>
+            </w:r>
+          </w:p>
+        </w:tc>
+        <w:tc>
+          <w:tcPr>
+            <w:tcW w:type="dxa" w:w="3120"/>
+            <w:tcBorders>
+              <w:top w:val="single" w:sz="4" w:color="CCCCCC"/>
+              <w:bottom w:val="single" w:sz="4" w:color="CCCCCC"/>
+              <w:left w:val="single" w:sz="4" w:color="CCCCCC"/>
+              <w:right w:val="single" w:sz="4" w:color="CCCCCC"/>
+            </w:tcBorders>
+            <w:vAlign w:val="center"/>
+          </w:tcPr>
+          <w:p>
+            <w:r/>
+            <w:r>
+              <w:rPr>
+                <w:rFonts w:ascii="Arial" w:hAnsi="Arial"/>
+                <w:color w:val="2E7D32"/>
+                <w:sz w:val="20"/>
+              </w:rPr>
+              <w:t>Punkt-estimat</w:t>
+            </w:r>
+          </w:p>
+        </w:tc>
+      </w:tr>
+    </w:tbl>
+    <w:p>
+      <w:pPr>
+        <w:spacing w:before="280" w:after="160"/>
+      </w:pPr>
+      <w:r>
+        <w:rPr>
+          <w:rFonts w:ascii="Arial" w:hAnsi="Arial"/>
+          <w:b/>
+          <w:color w:val="1F4E79"/>
+          <w:sz w:val="26"/>
+        </w:rPr>
+        <w:t>12.2 Hvorfor 'log R²=0.84' og '35% feil' ikke motsier hverandre</w:t>
+      </w:r>
+    </w:p>
+    <w:p>
+      <w:pPr>
+        <w:spacing w:before="80" w:after="80"/>
+      </w:pPr>
+      <w:r>
+        <w:rPr>
+          <w:rFonts w:ascii="Arial" w:hAnsi="Arial"/>
+          <w:sz w:val="22"/>
+        </w:rPr>
+        <w:t>Peak-modellen har log-space CV R²=0.84 men lineær median feil ~35%. Dette er konsistent: log-R² belønner å treffe størrelsesorden, mens lineær %-feil måler absolutt presisjon. Et felt predikert 0.34 vs faktisk 0.53 er −37% lineært, men bare −0.44 i log-skala (liten på SD~1.0). For NPV er det den lineære feilen som teller — derfor rapporterer vi den ærlig.</w:t>
+      </w:r>
+    </w:p>
+    <w:p>
+      <w:pPr>
+        <w:spacing w:before="80" w:after="80"/>
+      </w:pPr>
+      <w:r>
+        <w:rPr>
+          <w:rFonts w:ascii="Arial" w:hAnsi="Arial"/>
+          <w:b/>
+          <w:sz w:val="22"/>
+        </w:rPr>
+        <w:t>To regimer modellen ikke fanger med ex-ante data:</w:t>
+      </w:r>
+    </w:p>
+    <w:p>
+      <w:pPr>
+        <w:pStyle w:val="ListBullet"/>
+        <w:spacing w:before="40" w:after="40"/>
+      </w:pPr>
+      <w:r>
+        <w:rPr>
+          <w:rFonts w:ascii="Arial" w:hAnsi="Arial"/>
+          <w:sz w:val="22"/>
+        </w:rPr>
+        <w:t>Mega-felt (Johan Sverdrup, −68%): ekstrem deliverabilitet krever reservoardata (permeabilitet, net pay) som per definisjon ikke er kjent før produksjon</w:t>
+      </w:r>
+    </w:p>
+    <w:p>
+      <w:pPr>
+        <w:pStyle w:val="ListBullet"/>
+        <w:spacing w:before="40" w:after="40"/>
+      </w:pPr>
+      <w:r>
+        <w:rPr>
+          <w:rFonts w:ascii="Arial" w:hAnsi="Arial"/>
+          <w:sz w:val="22"/>
+        </w:rPr>
+        <w:t>Små tie-back-felt (Maria, +102%): peak settes av facility-arrangement, ikke reservoaret</w:t>
+      </w:r>
+    </w:p>
+    <w:p>
+      <w:pPr>
+        <w:spacing w:before="280" w:after="160"/>
+      </w:pPr>
+      <w:r>
+        <w:rPr>
+          <w:rFonts w:ascii="Arial" w:hAnsi="Arial"/>
+          <w:b/>
+          <w:color w:val="1F4E79"/>
+          <w:sz w:val="26"/>
+        </w:rPr>
+        <w:t>12.3 Korrekt bruk i ER</w:t>
+      </w:r>
+    </w:p>
+    <w:p>
+      <w:pPr>
+        <w:spacing w:before="80" w:after="80"/>
+      </w:pPr>
+      <w:r>
+        <w:rPr>
+          <w:rFonts w:ascii="Arial" w:hAnsi="Arial"/>
+          <w:sz w:val="22"/>
+        </w:rPr>
+        <w:t>Peak-modellen skal brukes til å triangulere mot operatør-guidance, ikke som et frittstående punkt-estimat. Dette er en sterkere ER-posisjon enn et oppblåst R²-tall — den tåler kritiske spørsmål i en modell-validering. Vi rapporterer det ekte out-of-sample-tallet (~35%), ikke det optimistiske log-R²=0.84 som om det betyr 16% feil.</w:t>
+      </w:r>
+    </w:p>
+    <w:p>
+      <w:pPr>
+        <w:spacing w:before="360" w:after="200"/>
+      </w:pPr>
+      <w:r>
+        <w:rPr>
+          <w:rFonts w:ascii="Arial" w:hAnsi="Arial"/>
+          <w:b/>
+          <w:color w:val="1F4E79"/>
+          <w:sz w:val="32"/>
+        </w:rPr>
+        <w:t>13. Case study: Yggdrasil (Aker BP NOAKA)</w:t>
+      </w:r>
+    </w:p>
+    <w:p>
+      <w:pPr>
+        <w:spacing w:before="80" w:after="80"/>
+      </w:pPr>
+      <w:r>
+        <w:rPr>
+          <w:rFonts w:ascii="Arial" w:hAnsi="Arial"/>
+          <w:sz w:val="22"/>
+        </w:rPr>
+        <w:t>Yggdrasil er Aker BPs store NOAKA-hub med planlagt produksjonsstart 2027. Vi anvender hele rammeverket på dette nye prosjektet — først på hub-nivå, deretter dekomponert i fem reservoarer.</w:t>
+      </w:r>
+    </w:p>
+    <w:p>
+      <w:pPr>
+        <w:spacing w:before="280" w:after="160"/>
+      </w:pPr>
+      <w:r>
+        <w:rPr>
+          <w:rFonts w:ascii="Arial" w:hAnsi="Arial"/>
+          <w:b/>
+          <w:color w:val="1F4E79"/>
+          <w:sz w:val="26"/>
+        </w:rPr>
+        <w:t>13.1 Hub-nivå med triangulerte scenarier</w:t>
+      </w:r>
+    </w:p>
+    <w:p>
+      <w:pPr>
+        <w:spacing w:before="80" w:after="80"/>
+      </w:pPr>
+      <w:r>
+        <w:rPr>
+          <w:rFonts w:ascii="Arial" w:hAnsi="Arial"/>
+          <w:sz w:val="22"/>
+        </w:rPr>
+        <w:t>Siden recoverable reserves er den dominerende usikkerheten, kjører vi tre scenarier:</w:t>
+      </w:r>
+    </w:p>
+    <w:tbl>
+      <w:tblPr>
+        <w:tblW w:type="auto" w:w="0"/>
+        <w:jc w:val="center"/>
+        <w:tblLook w:firstColumn="1" w:firstRow="1" w:lastColumn="0" w:lastRow="0" w:noHBand="0" w:noVBand="1" w:val="04A0"/>
+      </w:tblPr>
+      <w:tblGrid>
+        <w:gridCol w:w="2340"/>
+        <w:gridCol w:w="2340"/>
+        <w:gridCol w:w="2340"/>
+        <w:gridCol w:w="2340"/>
+      </w:tblGrid>
+      <w:tr>
+        <w:tc>
+          <w:tcPr>
+            <w:tcW w:type="dxa" w:w="2592"/>
+            <w:shd w:fill="1F4E79" w:val="clear"/>
+            <w:tcBorders>
+              <w:top w:val="single" w:sz="4" w:color="CCCCCC"/>
+              <w:bottom w:val="single" w:sz="4" w:color="CCCCCC"/>
+              <w:left w:val="single" w:sz="4" w:color="CCCCCC"/>
+              <w:right w:val="single" w:sz="4" w:color="CCCCCC"/>
+            </w:tcBorders>
+            <w:vAlign w:val="center"/>
+          </w:tcPr>
+          <w:p>
+            <w:pPr>
+              <w:jc w:val="center"/>
+            </w:pPr>
+            <w:r/>
+            <w:r>
+              <w:rPr>
+                <w:rFonts w:ascii="Arial" w:hAnsi="Arial"/>
+                <w:b/>
+                <w:color w:val="FFFFFF"/>
+                <w:sz w:val="20"/>
+              </w:rPr>
+              <w:t>Scenario</w:t>
+            </w:r>
+          </w:p>
+        </w:tc>
+        <w:tc>
+          <w:tcPr>
+            <w:tcW w:type="dxa" w:w="2592"/>
+            <w:shd w:fill="1F4E79" w:val="clear"/>
+            <w:tcBorders>
+              <w:top w:val="single" w:sz="4" w:color="CCCCCC"/>
+              <w:bottom w:val="single" w:sz="4" w:color="CCCCCC"/>
+              <w:left w:val="single" w:sz="4" w:color="CCCCCC"/>
+              <w:right w:val="single" w:sz="4" w:color="CCCCCC"/>
+            </w:tcBorders>
+            <w:vAlign w:val="center"/>
+          </w:tcPr>
+          <w:p>
+            <w:pPr>
+              <w:jc w:val="center"/>
+            </w:pPr>
+            <w:r/>
+            <w:r>
+              <w:rPr>
+                <w:rFonts w:ascii="Arial" w:hAnsi="Arial"/>
+                <w:b/>
+                <w:color w:val="FFFFFF"/>
+                <w:sz w:val="20"/>
+              </w:rPr>
+              <w:t>Recoverable</w:t>
+            </w:r>
+          </w:p>
+        </w:tc>
+        <w:tc>
+          <w:tcPr>
+            <w:tcW w:type="dxa" w:w="2592"/>
+            <w:shd w:fill="1F4E79" w:val="clear"/>
+            <w:tcBorders>
+              <w:top w:val="single" w:sz="4" w:color="CCCCCC"/>
+              <w:bottom w:val="single" w:sz="4" w:color="CCCCCC"/>
+              <w:left w:val="single" w:sz="4" w:color="CCCCCC"/>
+              <w:right w:val="single" w:sz="4" w:color="CCCCCC"/>
+            </w:tcBorders>
+            <w:vAlign w:val="center"/>
+          </w:tcPr>
+          <w:p>
+            <w:pPr>
+              <w:jc w:val="center"/>
+            </w:pPr>
+            <w:r/>
+            <w:r>
+              <w:rPr>
+                <w:rFonts w:ascii="Arial" w:hAnsi="Arial"/>
+                <w:b/>
+                <w:color w:val="FFFFFF"/>
+                <w:sz w:val="20"/>
+              </w:rPr>
+              <w:t>Peak P50</w:t>
+            </w:r>
+          </w:p>
+        </w:tc>
+        <w:tc>
+          <w:tcPr>
+            <w:tcW w:type="dxa" w:w="2592"/>
+            <w:shd w:fill="1F4E79" w:val="clear"/>
+            <w:tcBorders>
+              <w:top w:val="single" w:sz="4" w:color="CCCCCC"/>
+              <w:bottom w:val="single" w:sz="4" w:color="CCCCCC"/>
+              <w:left w:val="single" w:sz="4" w:color="CCCCCC"/>
+              <w:right w:val="single" w:sz="4" w:color="CCCCCC"/>
+            </w:tcBorders>
+            <w:vAlign w:val="center"/>
+          </w:tcPr>
+          <w:p>
+            <w:pPr>
+              <w:jc w:val="center"/>
+            </w:pPr>
+            <w:r/>
+            <w:r>
+              <w:rPr>
+                <w:rFonts w:ascii="Arial" w:hAnsi="Arial"/>
+                <w:b/>
+                <w:color w:val="FFFFFF"/>
+                <w:sz w:val="20"/>
+              </w:rPr>
+              <w:t>vs guidance</w:t>
+            </w:r>
+          </w:p>
+        </w:tc>
+      </w:tr>
+      <w:tr>
+        <w:tc>
+          <w:tcPr>
+            <w:tcW w:type="dxa" w:w="2340"/>
+            <w:tcBorders>
+              <w:top w:val="single" w:sz="4" w:color="CCCCCC"/>
+              <w:bottom w:val="single" w:sz="4" w:color="CCCCCC"/>
+              <w:left w:val="single" w:sz="4" w:color="CCCCCC"/>
+              <w:right w:val="single" w:sz="4" w:color="CCCCCC"/>
+            </w:tcBorders>
+            <w:vAlign w:val="center"/>
+          </w:tcPr>
+          <w:p>
+            <w:r/>
+            <w:r>
+              <w:rPr>
+                <w:rFonts w:ascii="Arial" w:hAnsi="Arial"/>
+                <w:sz w:val="20"/>
+              </w:rPr>
+              <w:t>Low</w:t>
+            </w:r>
+          </w:p>
+        </w:tc>
+        <w:tc>
+          <w:tcPr>
+            <w:tcW w:type="dxa" w:w="2340"/>
+            <w:tcBorders>
+              <w:top w:val="single" w:sz="4" w:color="CCCCCC"/>
+              <w:bottom w:val="single" w:sz="4" w:color="CCCCCC"/>
+              <w:left w:val="single" w:sz="4" w:color="CCCCCC"/>
+              <w:right w:val="single" w:sz="4" w:color="CCCCCC"/>
+            </w:tcBorders>
+            <w:vAlign w:val="center"/>
+          </w:tcPr>
+          <w:p>
+            <w:pPr>
+              <w:jc w:val="center"/>
+            </w:pPr>
+            <w:r/>
+            <w:r>
+              <w:rPr>
+                <w:rFonts w:ascii="Arial" w:hAnsi="Arial"/>
+                <w:sz w:val="20"/>
+              </w:rPr>
+              <w:t>30 MSm³</w:t>
+            </w:r>
+          </w:p>
+        </w:tc>
+        <w:tc>
+          <w:tcPr>
+            <w:tcW w:type="dxa" w:w="2340"/>
+            <w:tcBorders>
+              <w:top w:val="single" w:sz="4" w:color="CCCCCC"/>
+              <w:bottom w:val="single" w:sz="4" w:color="CCCCCC"/>
+              <w:left w:val="single" w:sz="4" w:color="CCCCCC"/>
+              <w:right w:val="single" w:sz="4" w:color="CCCCCC"/>
+            </w:tcBorders>
+            <w:vAlign w:val="center"/>
+          </w:tcPr>
+          <w:p>
+            <w:pPr>
+              <w:jc w:val="center"/>
+            </w:pPr>
+            <w:r/>
+            <w:r>
+              <w:rPr>
+                <w:rFonts w:ascii="Arial" w:hAnsi="Arial"/>
+                <w:sz w:val="20"/>
+              </w:rPr>
+              <w:t>111 kboe/d</w:t>
+            </w:r>
+          </w:p>
+        </w:tc>
+        <w:tc>
+          <w:tcPr>
+            <w:tcW w:type="dxa" w:w="2340"/>
+            <w:tcBorders>
+              <w:top w:val="single" w:sz="4" w:color="CCCCCC"/>
+              <w:bottom w:val="single" w:sz="4" w:color="CCCCCC"/>
+              <w:left w:val="single" w:sz="4" w:color="CCCCCC"/>
+              <w:right w:val="single" w:sz="4" w:color="CCCCCC"/>
+            </w:tcBorders>
+            <w:vAlign w:val="center"/>
+          </w:tcPr>
+          <w:p>
+            <w:pPr>
+              <w:jc w:val="center"/>
+            </w:pPr>
+            <w:r/>
+            <w:r>
+              <w:rPr>
+                <w:rFonts w:ascii="Arial" w:hAnsi="Arial"/>
+                <w:sz w:val="20"/>
+              </w:rPr>
+              <w:t>1.3×</w:t>
+            </w:r>
+          </w:p>
+        </w:tc>
+      </w:tr>
+      <w:tr>
+        <w:tc>
+          <w:tcPr>
+            <w:tcW w:type="dxa" w:w="2340"/>
+            <w:tcBorders>
+              <w:top w:val="single" w:sz="4" w:color="CCCCCC"/>
+              <w:bottom w:val="single" w:sz="4" w:color="CCCCCC"/>
+              <w:left w:val="single" w:sz="4" w:color="CCCCCC"/>
+              <w:right w:val="single" w:sz="4" w:color="CCCCCC"/>
+            </w:tcBorders>
+            <w:vAlign w:val="center"/>
+            <w:shd w:fill="E8F5E9" w:val="clear"/>
+          </w:tcPr>
+          <w:p>
+            <w:r/>
+            <w:r>
+              <w:rPr>
+                <w:rFonts w:ascii="Arial" w:hAnsi="Arial"/>
+                <w:b/>
+                <w:sz w:val="20"/>
+              </w:rPr>
+              <w:t>Base</w:t>
+            </w:r>
+          </w:p>
+        </w:tc>
+        <w:tc>
+          <w:tcPr>
+            <w:tcW w:type="dxa" w:w="2340"/>
+            <w:tcBorders>
+              <w:top w:val="single" w:sz="4" w:color="CCCCCC"/>
+              <w:bottom w:val="single" w:sz="4" w:color="CCCCCC"/>
+              <w:left w:val="single" w:sz="4" w:color="CCCCCC"/>
+              <w:right w:val="single" w:sz="4" w:color="CCCCCC"/>
+            </w:tcBorders>
+            <w:vAlign w:val="center"/>
+            <w:shd w:fill="E8F5E9" w:val="clear"/>
+          </w:tcPr>
+          <w:p>
+            <w:pPr>
+              <w:jc w:val="center"/>
+            </w:pPr>
+            <w:r/>
+            <w:r>
+              <w:rPr>
+                <w:rFonts w:ascii="Arial" w:hAnsi="Arial"/>
+                <w:b/>
+                <w:sz w:val="20"/>
+              </w:rPr>
+              <w:t>50 MSm³</w:t>
+            </w:r>
+          </w:p>
+        </w:tc>
+        <w:tc>
+          <w:tcPr>
+            <w:tcW w:type="dxa" w:w="2340"/>
+            <w:tcBorders>
+              <w:top w:val="single" w:sz="4" w:color="CCCCCC"/>
+              <w:bottom w:val="single" w:sz="4" w:color="CCCCCC"/>
+              <w:left w:val="single" w:sz="4" w:color="CCCCCC"/>
+              <w:right w:val="single" w:sz="4" w:color="CCCCCC"/>
+            </w:tcBorders>
+            <w:vAlign w:val="center"/>
+            <w:shd w:fill="E8F5E9" w:val="clear"/>
+          </w:tcPr>
+          <w:p>
+            <w:pPr>
+              <w:jc w:val="center"/>
+            </w:pPr>
+            <w:r/>
+            <w:r>
+              <w:rPr>
+                <w:rFonts w:ascii="Arial" w:hAnsi="Arial"/>
+                <w:b/>
+                <w:sz w:val="20"/>
+              </w:rPr>
+              <w:t>151 kboe/d</w:t>
+            </w:r>
+          </w:p>
+        </w:tc>
+        <w:tc>
+          <w:tcPr>
+            <w:tcW w:type="dxa" w:w="2340"/>
+            <w:tcBorders>
+              <w:top w:val="single" w:sz="4" w:color="CCCCCC"/>
+              <w:bottom w:val="single" w:sz="4" w:color="CCCCCC"/>
+              <w:left w:val="single" w:sz="4" w:color="CCCCCC"/>
+              <w:right w:val="single" w:sz="4" w:color="CCCCCC"/>
+            </w:tcBorders>
+            <w:vAlign w:val="center"/>
+            <w:shd w:fill="E8F5E9" w:val="clear"/>
+          </w:tcPr>
+          <w:p>
+            <w:pPr>
+              <w:jc w:val="center"/>
+            </w:pPr>
+            <w:r/>
+            <w:r>
+              <w:rPr>
+                <w:rFonts w:ascii="Arial" w:hAnsi="Arial"/>
+                <w:b/>
+                <w:sz w:val="20"/>
+              </w:rPr>
+              <w:t>1.8×</w:t>
+            </w:r>
+          </w:p>
+        </w:tc>
+      </w:tr>
+      <w:tr>
+        <w:tc>
+          <w:tcPr>
+            <w:tcW w:type="dxa" w:w="2340"/>
+            <w:tcBorders>
+              <w:top w:val="single" w:sz="4" w:color="CCCCCC"/>
+              <w:bottom w:val="single" w:sz="4" w:color="CCCCCC"/>
+              <w:left w:val="single" w:sz="4" w:color="CCCCCC"/>
+              <w:right w:val="single" w:sz="4" w:color="CCCCCC"/>
+            </w:tcBorders>
+            <w:vAlign w:val="center"/>
+          </w:tcPr>
+          <w:p>
+            <w:r/>
+            <w:r>
+              <w:rPr>
+                <w:rFonts w:ascii="Arial" w:hAnsi="Arial"/>
+                <w:sz w:val="20"/>
+              </w:rPr>
+              <w:t>High</w:t>
+            </w:r>
+          </w:p>
+        </w:tc>
+        <w:tc>
+          <w:tcPr>
+            <w:tcW w:type="dxa" w:w="2340"/>
+            <w:tcBorders>
+              <w:top w:val="single" w:sz="4" w:color="CCCCCC"/>
+              <w:bottom w:val="single" w:sz="4" w:color="CCCCCC"/>
+              <w:left w:val="single" w:sz="4" w:color="CCCCCC"/>
+              <w:right w:val="single" w:sz="4" w:color="CCCCCC"/>
+            </w:tcBorders>
+            <w:vAlign w:val="center"/>
+          </w:tcPr>
+          <w:p>
+            <w:pPr>
+              <w:jc w:val="center"/>
+            </w:pPr>
+            <w:r/>
+            <w:r>
+              <w:rPr>
+                <w:rFonts w:ascii="Arial" w:hAnsi="Arial"/>
+                <w:sz w:val="20"/>
+              </w:rPr>
+              <w:t>80 MSm³</w:t>
+            </w:r>
+          </w:p>
+        </w:tc>
+        <w:tc>
+          <w:tcPr>
+            <w:tcW w:type="dxa" w:w="2340"/>
+            <w:tcBorders>
+              <w:top w:val="single" w:sz="4" w:color="CCCCCC"/>
+              <w:bottom w:val="single" w:sz="4" w:color="CCCCCC"/>
+              <w:left w:val="single" w:sz="4" w:color="CCCCCC"/>
+              <w:right w:val="single" w:sz="4" w:color="CCCCCC"/>
+            </w:tcBorders>
+            <w:vAlign w:val="center"/>
+          </w:tcPr>
+          <w:p>
+            <w:pPr>
+              <w:jc w:val="center"/>
+            </w:pPr>
+            <w:r/>
+            <w:r>
+              <w:rPr>
+                <w:rFonts w:ascii="Arial" w:hAnsi="Arial"/>
+                <w:sz w:val="20"/>
+              </w:rPr>
+              <w:t>189 kboe/d</w:t>
+            </w:r>
+          </w:p>
+        </w:tc>
+        <w:tc>
+          <w:tcPr>
+            <w:tcW w:type="dxa" w:w="2340"/>
+            <w:tcBorders>
+              <w:top w:val="single" w:sz="4" w:color="CCCCCC"/>
+              <w:bottom w:val="single" w:sz="4" w:color="CCCCCC"/>
+              <w:left w:val="single" w:sz="4" w:color="CCCCCC"/>
+              <w:right w:val="single" w:sz="4" w:color="CCCCCC"/>
+            </w:tcBorders>
+            <w:vAlign w:val="center"/>
+          </w:tcPr>
+          <w:p>
+            <w:pPr>
+              <w:jc w:val="center"/>
+            </w:pPr>
+            <w:r/>
+            <w:r>
+              <w:rPr>
+                <w:rFonts w:ascii="Arial" w:hAnsi="Arial"/>
+                <w:sz w:val="20"/>
+              </w:rPr>
+              <w:t>2.2×</w:t>
+            </w:r>
+          </w:p>
+        </w:tc>
+      </w:tr>
+    </w:tbl>
+    <w:p>
+      <w:pPr>
+        <w:spacing w:after="200"/>
+        <w:jc w:val="center"/>
+      </w:pPr>
+      <w:r>
+        <w:rPr>
+          <w:rFonts w:ascii="Arial" w:hAnsi="Arial"/>
+          <w:i/>
+          <w:color w:val="595959"/>
+          <w:sz w:val="18"/>
+        </w:rPr>
+        <w:t>Aker BP CMD-guidance: ~85 kboe/d olje peak.</w:t>
+      </w:r>
+    </w:p>
+    <w:p>
+      <w:pPr>
+        <w:spacing w:before="200" w:after="100"/>
+        <w:jc w:val="center"/>
+      </w:pPr>
+      <w:r>
+        <w:drawing>
+          <wp:inline xmlns:a="http://schemas.openxmlformats.org/drawingml/2006/main" xmlns:pic="http://schemas.openxmlformats.org/drawingml/2006/picture">
+            <wp:extent cx="5943600" cy="4402834"/>
+            <wp:docPr id="7" name="Picture 7"/>
+            <wp:cNvGraphicFramePr>
+              <a:graphicFrameLocks noChangeAspect="1"/>
+            </wp:cNvGraphicFramePr>
+            <a:graphic>
+              <a:graphicData uri="http://schemas.openxmlformats.org/drawingml/2006/picture">
+                <pic:pic>
+                  <pic:nvPicPr>
+                    <pic:cNvPr id="0" name="fig_yggdrasil_v2.png"/>
+                    <pic:cNvPicPr/>
+                  </pic:nvPicPr>
+                  <pic:blipFill>
+                    <a:blip r:embed="rId15"/>
+                    <a:stretch>
+                      <a:fillRect/>
+                    </a:stretch>
+                  </pic:blipFill>
+                  <pic:spPr>
+                    <a:xfrm>
+                      <a:off x="0" y="0"/>
+                      <a:ext cx="5943600" cy="4402834"/>
+                    </a:xfrm>
+                    <a:prstGeom prst="rect"/>
+                  </pic:spPr>
+                </pic:pic>
+              </a:graphicData>
+            </a:graphic>
+          </wp:inline>
+        </w:drawing>
+      </w:r>
+    </w:p>
+    <w:p>
+      <w:pPr>
+        <w:spacing w:after="200"/>
+        <w:jc w:val="center"/>
+      </w:pPr>
+      <w:r>
+        <w:rPr>
+          <w:rFonts w:ascii="Arial" w:hAnsi="Arial"/>
+          <w:i/>
+          <w:color w:val="595959"/>
+          <w:sz w:val="18"/>
+        </w:rPr>
+        <w:t>Figur 7: Yggdrasil V2 forecast. Øverst: hub-nivå tre scenarier. Midten/nederst: aggregat og fem komponenter (Krafla, Fulla, Frøy, Munin, Hugin) med staggered first oil og P10/P50/P90-bånd.</w:t>
+      </w:r>
+    </w:p>
+    <w:p>
+      <w:pPr>
+        <w:spacing w:before="280" w:after="160"/>
+      </w:pPr>
+      <w:r>
+        <w:rPr>
+          <w:rFonts w:ascii="Arial" w:hAnsi="Arial"/>
+          <w:b/>
+          <w:color w:val="1F4E79"/>
+          <w:sz w:val="26"/>
+        </w:rPr>
+        <w:t>13.2 ER-tolkning</w:t>
+      </w:r>
+    </w:p>
+    <w:p>
+      <w:pPr>
+        <w:spacing w:before="80" w:after="80"/>
+      </w:pPr>
+      <w:r>
+        <w:rPr>
+          <w:rFonts w:ascii="Arial" w:hAnsi="Arial"/>
+          <w:sz w:val="22"/>
+        </w:rPr>
+        <w:t>Modellen sier konsistent over operatør-guidance (1.3-2.2×). Tre forklaringer, alle ER-relevante:</w:t>
+      </w:r>
+    </w:p>
+    <w:p>
+      <w:pPr>
+        <w:pStyle w:val="ListBullet"/>
+        <w:spacing w:before="40" w:after="40"/>
+      </w:pPr>
+      <w:r>
+        <w:rPr>
+          <w:rFonts w:ascii="Arial" w:hAnsi="Arial"/>
+          <w:sz w:val="22"/>
+        </w:rPr>
+        <w:t>PDO-konservatisme: operatører guider typisk lavt; NCS-felt outperformer ofte initial-guidance med 30-70%</w:t>
+      </w:r>
+    </w:p>
+    <w:p>
+      <w:pPr>
+        <w:pStyle w:val="ListBullet"/>
+        <w:spacing w:before="40" w:after="40"/>
+      </w:pPr>
+      <w:r>
+        <w:rPr>
+          <w:rFonts w:ascii="Arial" w:hAnsi="Arial"/>
+          <w:sz w:val="22"/>
+        </w:rPr>
+        <w:t>Vår modell underpredikerer systematisk (−11% bias selv etter smearing), så gapet til guidance kan være enda større</w:t>
+      </w:r>
+    </w:p>
+    <w:p>
+      <w:pPr>
+        <w:pStyle w:val="ListBullet"/>
+        <w:spacing w:before="40" w:after="40"/>
+      </w:pPr>
+      <w:r>
+        <w:rPr>
+          <w:rFonts w:ascii="Arial" w:hAnsi="Arial"/>
+          <w:sz w:val="22"/>
+        </w:rPr>
+        <w:t>Komponent-aggregatet (221 kboe/d) er høyere enn hub-nivå, da hver tie-back bidrar med egen peak</w:t>
+      </w:r>
+    </w:p>
+    <w:p>
+      <w:pPr>
+        <w:spacing w:before="80" w:after="80"/>
+      </w:pPr>
+      <w:r>
+        <w:rPr>
+          <w:rFonts w:ascii="Arial" w:hAnsi="Arial"/>
+          <w:sz w:val="22"/>
+        </w:rPr>
+        <w:t>Den ærlige ER-observasjonen: "Yggdrasil viser oppside til Aker BP's produksjons-guidance, med et P10-P90-bånd på 119-189 kboe/d (hub-nivå, base scenario). Dette er en triangulering, ikke et presist punkt-estimat — peak-usikkerheten er ±35%."</w:t>
+      </w:r>
+    </w:p>
+    <w:p>
+      <w:r>
+        <w:br w:type="page"/>
+      </w:r>
+    </w:p>
+    <w:p>
+      <w:pPr>
+        <w:spacing w:before="360" w:after="200"/>
+      </w:pPr>
+      <w:r>
+        <w:rPr>
+          <w:rFonts w:ascii="Arial" w:hAnsi="Arial"/>
+          <w:b/>
+          <w:color w:val="1F4E79"/>
+          <w:sz w:val="32"/>
+        </w:rPr>
         <w:t>Appendix A: Modellutvikling-historikk</w:t>
       </w:r>
     </w:p>
@@ -11148,7 +13538,7 @@
                 <w:b/>
                 <w:sz w:val="20"/>
               </w:rPr>
-              <w:t>+ Felt-spesifikk T (V5 final) ★</w:t>
+              <w:t>+ Felt-spesifikk T (V5.1 final) ★</w:t>
             </w:r>
           </w:p>
         </w:tc>
@@ -11173,7 +13563,7 @@
                 <w:color w:val="2E7D32"/>
                 <w:sz w:val="20"/>
               </w:rPr>
-              <w:t>0.702</w:t>
+              <w:t>0.662*</w:t>
             </w:r>
           </w:p>
         </w:tc>
@@ -11198,7 +13588,404 @@
                 <w:color w:val="2E7D32"/>
                 <w:sz w:val="20"/>
               </w:rPr>
-              <w:t>0.061</w:t>
+              <w:t>0.062</w:t>
+            </w:r>
+          </w:p>
+        </w:tc>
+      </w:tr>
+    </w:tbl>
+    <w:p>
+      <w:pPr>
+        <w:spacing w:after="200"/>
+        <w:jc w:val="center"/>
+      </w:pPr>
+      <w:r>
+        <w:rPr>
+          <w:rFonts w:ascii="Arial" w:hAnsi="Arial"/>
+          <w:i/>
+          <w:color w:val="595959"/>
+          <w:sz w:val="18"/>
+        </w:rPr>
+        <w:t>*Trinn 7 viser ærlig nested CV R²=0.662 (trinn 4-6 viser simple LOO som var litt optimistisk pga premium-sirkularitet, korrigert i V5.1).</w:t>
+      </w:r>
+    </w:p>
+    <w:p>
+      <w:pPr>
+        <w:spacing w:before="80" w:after="80"/>
+      </w:pPr>
+      <w:r>
+        <w:rPr>
+          <w:rFonts w:ascii="Arial" w:hAnsi="Arial"/>
+          <w:sz w:val="22"/>
+        </w:rPr>
+        <w:t>Pre-peak forecast-suite (V2) ble bygget på toppen av decline-modellen:</w:t>
+      </w:r>
+    </w:p>
+    <w:tbl>
+      <w:tblPr>
+        <w:tblW w:type="auto" w:w="0"/>
+        <w:jc w:val="center"/>
+        <w:tblLook w:firstColumn="1" w:firstRow="1" w:lastColumn="0" w:lastRow="0" w:noHBand="0" w:noVBand="1" w:val="04A0"/>
+      </w:tblPr>
+      <w:tblGrid>
+        <w:gridCol w:w="3120"/>
+        <w:gridCol w:w="3120"/>
+        <w:gridCol w:w="3120"/>
+      </w:tblGrid>
+      <w:tr>
+        <w:tc>
+          <w:tcPr>
+            <w:tcW w:type="dxa" w:w="3744"/>
+            <w:shd w:fill="1F4E79" w:val="clear"/>
+            <w:tcBorders>
+              <w:top w:val="single" w:sz="4" w:color="CCCCCC"/>
+              <w:bottom w:val="single" w:sz="4" w:color="CCCCCC"/>
+              <w:left w:val="single" w:sz="4" w:color="CCCCCC"/>
+              <w:right w:val="single" w:sz="4" w:color="CCCCCC"/>
+            </w:tcBorders>
+            <w:vAlign w:val="center"/>
+          </w:tcPr>
+          <w:p>
+            <w:pPr>
+              <w:jc w:val="center"/>
+            </w:pPr>
+            <w:r/>
+            <w:r>
+              <w:rPr>
+                <w:rFonts w:ascii="Arial" w:hAnsi="Arial"/>
+                <w:b/>
+                <w:color w:val="FFFFFF"/>
+                <w:sz w:val="20"/>
+              </w:rPr>
+              <w:t>Modell</w:t>
+            </w:r>
+          </w:p>
+        </w:tc>
+        <w:tc>
+          <w:tcPr>
+            <w:tcW w:type="dxa" w:w="3168"/>
+            <w:shd w:fill="1F4E79" w:val="clear"/>
+            <w:tcBorders>
+              <w:top w:val="single" w:sz="4" w:color="CCCCCC"/>
+              <w:bottom w:val="single" w:sz="4" w:color="CCCCCC"/>
+              <w:left w:val="single" w:sz="4" w:color="CCCCCC"/>
+              <w:right w:val="single" w:sz="4" w:color="CCCCCC"/>
+            </w:tcBorders>
+            <w:vAlign w:val="center"/>
+          </w:tcPr>
+          <w:p>
+            <w:pPr>
+              <w:jc w:val="center"/>
+            </w:pPr>
+            <w:r/>
+            <w:r>
+              <w:rPr>
+                <w:rFonts w:ascii="Arial" w:hAnsi="Arial"/>
+                <w:b/>
+                <w:color w:val="FFFFFF"/>
+                <w:sz w:val="20"/>
+              </w:rPr>
+              <w:t>Out-of-sample</w:t>
+            </w:r>
+          </w:p>
+        </w:tc>
+        <w:tc>
+          <w:tcPr>
+            <w:tcW w:type="dxa" w:w="2880"/>
+            <w:shd w:fill="1F4E79" w:val="clear"/>
+            <w:tcBorders>
+              <w:top w:val="single" w:sz="4" w:color="CCCCCC"/>
+              <w:bottom w:val="single" w:sz="4" w:color="CCCCCC"/>
+              <w:left w:val="single" w:sz="4" w:color="CCCCCC"/>
+              <w:right w:val="single" w:sz="4" w:color="CCCCCC"/>
+            </w:tcBorders>
+            <w:vAlign w:val="center"/>
+          </w:tcPr>
+          <w:p>
+            <w:pPr>
+              <w:jc w:val="center"/>
+            </w:pPr>
+            <w:r/>
+            <w:r>
+              <w:rPr>
+                <w:rFonts w:ascii="Arial" w:hAnsi="Arial"/>
+                <w:b/>
+                <w:color w:val="FFFFFF"/>
+                <w:sz w:val="20"/>
+              </w:rPr>
+              <w:t>Status</w:t>
+            </w:r>
+          </w:p>
+        </w:tc>
+      </w:tr>
+      <w:tr>
+        <w:tc>
+          <w:tcPr>
+            <w:tcW w:type="dxa" w:w="3120"/>
+            <w:tcBorders>
+              <w:top w:val="single" w:sz="4" w:color="CCCCCC"/>
+              <w:bottom w:val="single" w:sz="4" w:color="CCCCCC"/>
+              <w:left w:val="single" w:sz="4" w:color="CCCCCC"/>
+              <w:right w:val="single" w:sz="4" w:color="CCCCCC"/>
+            </w:tcBorders>
+            <w:vAlign w:val="center"/>
+          </w:tcPr>
+          <w:p>
+            <w:r/>
+            <w:r>
+              <w:rPr>
+                <w:rFonts w:ascii="Arial" w:hAnsi="Arial"/>
+                <w:sz w:val="20"/>
+              </w:rPr>
+              <w:t>Peak (med smearing)</w:t>
+            </w:r>
+          </w:p>
+        </w:tc>
+        <w:tc>
+          <w:tcPr>
+            <w:tcW w:type="dxa" w:w="3120"/>
+            <w:tcBorders>
+              <w:top w:val="single" w:sz="4" w:color="CCCCCC"/>
+              <w:bottom w:val="single" w:sz="4" w:color="CCCCCC"/>
+              <w:left w:val="single" w:sz="4" w:color="CCCCCC"/>
+              <w:right w:val="single" w:sz="4" w:color="CCCCCC"/>
+            </w:tcBorders>
+            <w:vAlign w:val="center"/>
+          </w:tcPr>
+          <w:p>
+            <w:r/>
+            <w:r>
+              <w:rPr>
+                <w:rFonts w:ascii="Arial" w:hAnsi="Arial"/>
+                <w:sz w:val="20"/>
+              </w:rPr>
+              <w:t>±35% median</w:t>
+            </w:r>
+          </w:p>
+        </w:tc>
+        <w:tc>
+          <w:tcPr>
+            <w:tcW w:type="dxa" w:w="3120"/>
+            <w:tcBorders>
+              <w:top w:val="single" w:sz="4" w:color="CCCCCC"/>
+              <w:bottom w:val="single" w:sz="4" w:color="CCCCCC"/>
+              <w:left w:val="single" w:sz="4" w:color="CCCCCC"/>
+              <w:right w:val="single" w:sz="4" w:color="CCCCCC"/>
+            </w:tcBorders>
+            <w:vAlign w:val="center"/>
+          </w:tcPr>
+          <w:p>
+            <w:r/>
+            <w:r>
+              <w:rPr>
+                <w:rFonts w:ascii="Arial" w:hAnsi="Arial"/>
+                <w:sz w:val="20"/>
+              </w:rPr>
+              <w:t>Range-verktøy</w:t>
+            </w:r>
+          </w:p>
+        </w:tc>
+      </w:tr>
+      <w:tr>
+        <w:tc>
+          <w:tcPr>
+            <w:tcW w:type="dxa" w:w="3120"/>
+            <w:tcBorders>
+              <w:top w:val="single" w:sz="4" w:color="CCCCCC"/>
+              <w:bottom w:val="single" w:sz="4" w:color="CCCCCC"/>
+              <w:left w:val="single" w:sz="4" w:color="CCCCCC"/>
+              <w:right w:val="single" w:sz="4" w:color="CCCCCC"/>
+            </w:tcBorders>
+            <w:vAlign w:val="center"/>
+          </w:tcPr>
+          <w:p>
+            <w:r/>
+            <w:r>
+              <w:rPr>
+                <w:rFonts w:ascii="Arial" w:hAnsi="Arial"/>
+                <w:sz w:val="20"/>
+              </w:rPr>
+              <w:t>Ramp duration</w:t>
+            </w:r>
+          </w:p>
+        </w:tc>
+        <w:tc>
+          <w:tcPr>
+            <w:tcW w:type="dxa" w:w="3120"/>
+            <w:tcBorders>
+              <w:top w:val="single" w:sz="4" w:color="CCCCCC"/>
+              <w:bottom w:val="single" w:sz="4" w:color="CCCCCC"/>
+              <w:left w:val="single" w:sz="4" w:color="CCCCCC"/>
+              <w:right w:val="single" w:sz="4" w:color="CCCCCC"/>
+            </w:tcBorders>
+            <w:vAlign w:val="center"/>
+          </w:tcPr>
+          <w:p>
+            <w:r/>
+            <w:r>
+              <w:rPr>
+                <w:rFonts w:ascii="Arial" w:hAnsi="Arial"/>
+                <w:sz w:val="20"/>
+              </w:rPr>
+              <w:t>±5 mnd</w:t>
+            </w:r>
+          </w:p>
+        </w:tc>
+        <w:tc>
+          <w:tcPr>
+            <w:tcW w:type="dxa" w:w="3120"/>
+            <w:tcBorders>
+              <w:top w:val="single" w:sz="4" w:color="CCCCCC"/>
+              <w:bottom w:val="single" w:sz="4" w:color="CCCCCC"/>
+              <w:left w:val="single" w:sz="4" w:color="CCCCCC"/>
+              <w:right w:val="single" w:sz="4" w:color="CCCCCC"/>
+            </w:tcBorders>
+            <w:vAlign w:val="center"/>
+          </w:tcPr>
+          <w:p>
+            <w:r/>
+            <w:r>
+              <w:rPr>
+                <w:rFonts w:ascii="Arial" w:hAnsi="Arial"/>
+                <w:sz w:val="20"/>
+              </w:rPr>
+              <w:t>Punkt-estimat</w:t>
+            </w:r>
+          </w:p>
+        </w:tc>
+      </w:tr>
+      <w:tr>
+        <w:tc>
+          <w:tcPr>
+            <w:tcW w:type="dxa" w:w="3120"/>
+            <w:tcBorders>
+              <w:top w:val="single" w:sz="4" w:color="CCCCCC"/>
+              <w:bottom w:val="single" w:sz="4" w:color="CCCCCC"/>
+              <w:left w:val="single" w:sz="4" w:color="CCCCCC"/>
+              <w:right w:val="single" w:sz="4" w:color="CCCCCC"/>
+            </w:tcBorders>
+            <w:vAlign w:val="center"/>
+          </w:tcPr>
+          <w:p>
+            <w:r/>
+            <w:r>
+              <w:rPr>
+                <w:rFonts w:ascii="Arial" w:hAnsi="Arial"/>
+                <w:sz w:val="20"/>
+              </w:rPr>
+              <w:t>Plateau duration</w:t>
+            </w:r>
+          </w:p>
+        </w:tc>
+        <w:tc>
+          <w:tcPr>
+            <w:tcW w:type="dxa" w:w="3120"/>
+            <w:tcBorders>
+              <w:top w:val="single" w:sz="4" w:color="CCCCCC"/>
+              <w:bottom w:val="single" w:sz="4" w:color="CCCCCC"/>
+              <w:left w:val="single" w:sz="4" w:color="CCCCCC"/>
+              <w:right w:val="single" w:sz="4" w:color="CCCCCC"/>
+            </w:tcBorders>
+            <w:vAlign w:val="center"/>
+          </w:tcPr>
+          <w:p>
+            <w:r/>
+            <w:r>
+              <w:rPr>
+                <w:rFonts w:ascii="Arial" w:hAnsi="Arial"/>
+                <w:sz w:val="20"/>
+              </w:rPr>
+              <w:t>±4 mnd</w:t>
+            </w:r>
+          </w:p>
+        </w:tc>
+        <w:tc>
+          <w:tcPr>
+            <w:tcW w:type="dxa" w:w="3120"/>
+            <w:tcBorders>
+              <w:top w:val="single" w:sz="4" w:color="CCCCCC"/>
+              <w:bottom w:val="single" w:sz="4" w:color="CCCCCC"/>
+              <w:left w:val="single" w:sz="4" w:color="CCCCCC"/>
+              <w:right w:val="single" w:sz="4" w:color="CCCCCC"/>
+            </w:tcBorders>
+            <w:vAlign w:val="center"/>
+          </w:tcPr>
+          <w:p>
+            <w:r/>
+            <w:r>
+              <w:rPr>
+                <w:rFonts w:ascii="Arial" w:hAnsi="Arial"/>
+                <w:sz w:val="20"/>
+              </w:rPr>
+              <w:t>Punkt-estimat</w:t>
+            </w:r>
+          </w:p>
+        </w:tc>
+      </w:tr>
+      <w:tr>
+        <w:tc>
+          <w:tcPr>
+            <w:tcW w:type="dxa" w:w="3120"/>
+            <w:tcBorders>
+              <w:top w:val="single" w:sz="4" w:color="CCCCCC"/>
+              <w:bottom w:val="single" w:sz="4" w:color="CCCCCC"/>
+              <w:left w:val="single" w:sz="4" w:color="CCCCCC"/>
+              <w:right w:val="single" w:sz="4" w:color="CCCCCC"/>
+            </w:tcBorders>
+            <w:vAlign w:val="center"/>
+          </w:tcPr>
+          <w:p>
+            <w:r/>
+            <w:r>
+              <w:rPr>
+                <w:rFonts w:ascii="Arial" w:hAnsi="Arial"/>
+                <w:sz w:val="20"/>
+              </w:rPr>
+              <w:t>Lifecycle (joint bootstrap)</w:t>
+            </w:r>
+          </w:p>
+        </w:tc>
+        <w:tc>
+          <w:tcPr>
+            <w:tcW w:type="dxa" w:w="3120"/>
+            <w:tcBorders>
+              <w:top w:val="single" w:sz="4" w:color="CCCCCC"/>
+              <w:bottom w:val="single" w:sz="4" w:color="CCCCCC"/>
+              <w:left w:val="single" w:sz="4" w:color="CCCCCC"/>
+              <w:right w:val="single" w:sz="4" w:color="CCCCCC"/>
+            </w:tcBorders>
+            <w:vAlign w:val="center"/>
+          </w:tcPr>
+          <w:p>
+            <w:r/>
+            <w:r>
+              <w:rPr>
+                <w:rFonts w:ascii="Arial" w:hAnsi="Arial"/>
+                <w:sz w:val="20"/>
+              </w:rPr>
+              <w:t>recovery 1.00-1.01</w:t>
+            </w:r>
+          </w:p>
+        </w:tc>
+        <w:tc>
+          <w:tcPr>
+            <w:tcW w:type="dxa" w:w="3120"/>
+            <w:tcBorders>
+              <w:top w:val="single" w:sz="4" w:color="CCCCCC"/>
+              <w:bottom w:val="single" w:sz="4" w:color="CCCCCC"/>
+              <w:left w:val="single" w:sz="4" w:color="CCCCCC"/>
+              <w:right w:val="single" w:sz="4" w:color="CCCCCC"/>
+            </w:tcBorders>
+            <w:vAlign w:val="center"/>
+          </w:tcPr>
+          <w:p>
+            <w:r/>
+            <w:r>
+              <w:rPr>
+                <w:rFonts w:ascii="Arial" w:hAnsi="Arial"/>
+                <w:sz w:val="20"/>
+              </w:rPr>
+              <w:t>Scenario-verktøy</w:t>
             </w:r>
           </w:p>
         </w:tc>

</xml_diff>